<commit_message>
Update Annex 28 Complaints Handling Guideline translation
Co-Authored-By: Claude Opus 4.6 <noreply@anthropic.com>
Claude-Session: https://claude.ai/code/session_01N9ZP28hxEfPoWHf2qaE8QM
</commit_message>
<xml_diff>
--- a/Computer Engineering, Software Engineering, Computer systems & their softwares/Annexes/Annex №28 Complaints Handling Guideline.docx
+++ b/Computer Engineering, Software Engineering, Computer systems & their softwares/Annexes/Annex №28 Complaints Handling Guideline.docx
@@ -183,11 +183,17 @@
           <w:color w:val="000000"/>
           <w:sz w:val="28"/>
         </w:rPr>
-        <w:t xml:space="preserve">APPROVED </w:t>
-      </w:r>
-      <w:r>
+        <w:t xml:space="preserve">TASDIQLANGAN </w:t>
         <w:br/>
-      </w:r>
+        <w:t xml:space="preserve">Fizika va matematika fakulteti </w:t>
+        <w:br/>
+        <w:t xml:space="preserve">dekani </w:t>
+        <w:br/>
+        <w:t xml:space="preserve">_______________ A.Sh. Safarov </w:t>
+        <w:br/>
+        <w:t>"____" __________ 2026 y.</w:t>
+      </w:r>
+      <w:r/>
       <w:r>
         <w:rPr>
           <w:rFonts w:ascii="Arial" w:hAnsi="Arial" w:eastAsia="Arial"/>
@@ -196,11 +202,8 @@
           <w:color w:val="000000"/>
           <w:sz w:val="28"/>
         </w:rPr>
-        <w:t xml:space="preserve">Dean of the Faculty of Physics and </w:t>
-      </w:r>
-      <w:r>
-        <w:br/>
-      </w:r>
+      </w:r>
+      <w:r/>
       <w:r>
         <w:rPr>
           <w:rFonts w:ascii="Arial" w:hAnsi="Arial" w:eastAsia="Arial"/>
@@ -209,11 +212,8 @@
           <w:color w:val="000000"/>
           <w:sz w:val="28"/>
         </w:rPr>
-        <w:t xml:space="preserve">Mathematics </w:t>
-      </w:r>
-      <w:r>
-        <w:br/>
-      </w:r>
+      </w:r>
+      <w:r/>
       <w:r>
         <w:rPr>
           <w:rFonts w:ascii="Arial" w:hAnsi="Arial" w:eastAsia="Arial"/>
@@ -222,11 +222,8 @@
           <w:color w:val="000000"/>
           <w:sz w:val="28"/>
         </w:rPr>
-        <w:t xml:space="preserve">_______________ A.Sh. Safarov </w:t>
-      </w:r>
-      <w:r>
-        <w:br/>
-      </w:r>
+      </w:r>
+      <w:r/>
       <w:r>
         <w:rPr>
           <w:rFonts w:ascii="Arial" w:hAnsi="Arial" w:eastAsia="Arial"/>
@@ -235,7 +232,6 @@
           <w:color w:val="000000"/>
           <w:sz w:val="28"/>
         </w:rPr>
-        <w:t xml:space="preserve">“____” __________ 2026 </w:t>
       </w:r>
     </w:p>
     <w:p>
@@ -370,7 +366,7 @@
           <w:color w:val="000000"/>
           <w:sz w:val="28"/>
         </w:rPr>
-        <w:t xml:space="preserve">The Guideline has been developed on the basis of the requirements of </w:t>
+        <w:t>Yo'riqnoma O'zbekiston Respublikasi Vazirlar Mahkamasining 2006-yil 10-fevraldagi 20-sonli qarori bilan tasdiqlangan "Oliy ta'lim muassasalariga pedagog kadrlarni tanlov asosida ishga qabul qilish tartibi to'g'risida"gi nizom talablari asosida ishlab chiqilgan.</w:t>
       </w:r>
       <w:r>
         <w:rPr>
@@ -380,7 +376,6 @@
           <w:color w:val="000000"/>
           <w:sz w:val="28"/>
         </w:rPr>
-        <w:t xml:space="preserve">the Regulation “On the Procedure for the Competitive Recruitment of </w:t>
       </w:r>
       <w:r>
         <w:rPr>
@@ -390,7 +385,6 @@
           <w:color w:val="000000"/>
           <w:sz w:val="28"/>
         </w:rPr>
-        <w:t xml:space="preserve">Teaching Staff to Higher Education Institutions,” approved by Resolution No. </w:t>
       </w:r>
       <w:r>
         <w:rPr>
@@ -400,7 +394,6 @@
           <w:color w:val="000000"/>
           <w:sz w:val="28"/>
         </w:rPr>
-        <w:t xml:space="preserve">20 of the Cabinet of Ministers of the Republic of Uzbekistan dated 10 </w:t>
       </w:r>
       <w:r>
         <w:rPr>
@@ -410,7 +403,6 @@
           <w:color w:val="000000"/>
           <w:sz w:val="28"/>
         </w:rPr>
-        <w:t xml:space="preserve">February 2006. </w:t>
       </w:r>
     </w:p>
     <w:p>
@@ -430,7 +422,7 @@
           <w:color w:val="000000"/>
           <w:sz w:val="28"/>
         </w:rPr>
-        <w:t xml:space="preserve">The Guideline was discussed at meeting No. “___” of the Department </w:t>
+        <w:t>Yo'riqnoma Fizika kafedrasining 2026-yil "____" ________da bo'lib o'tgan "___"-sonli yig'ilishida muhokama qilingan va Fakultet kengashiga tavsiya etilgan.</w:t>
       </w:r>
       <w:r>
         <w:rPr>
@@ -440,7 +432,6 @@
           <w:color w:val="000000"/>
           <w:sz w:val="28"/>
         </w:rPr>
-        <w:t xml:space="preserve">of Physics, held on “____” ________ 2026, and recommended to the Faculty </w:t>
       </w:r>
       <w:r>
         <w:rPr>
@@ -450,7 +441,6 @@
           <w:color w:val="000000"/>
           <w:sz w:val="28"/>
         </w:rPr>
-        <w:t xml:space="preserve">Council. </w:t>
       </w:r>
     </w:p>
     <w:p>
@@ -493,7 +483,7 @@
           <w:color w:val="000000"/>
           <w:sz w:val="28"/>
         </w:rPr>
-        <w:t xml:space="preserve">The Guideline was approved by decision No. “___” of the Council of the </w:t>
+        <w:t>Yo'riqnoma Fizika va matematika fakulteti kengashining 2026-yil "____" ________dagi "___"-sonli qarori bilan tasdiqlangan.</w:t>
       </w:r>
       <w:r>
         <w:rPr>
@@ -503,7 +493,6 @@
           <w:color w:val="000000"/>
           <w:sz w:val="28"/>
         </w:rPr>
-        <w:t xml:space="preserve">Faculty of Physics and Mathematics, dated “____” ________ 2026. </w:t>
       </w:r>
     </w:p>
     <w:p>
@@ -607,6 +596,11 @@
       </w:pPr>
       <w:r>
         <w:tab/>
+        <w:t xml:space="preserve">1-BOB. UMUMIY QOIDALAR </w:t>
+        <w:br/>
+        <w:t xml:space="preserve">1.1. Yo'riqnomaning maqsadi </w:t>
+        <w:br/>
+        <w:t>1. Ushbu Yo'riqnoma (bundan buyon — "Yo'riqnoma") Termiz davlat universiteti Fizika va matematika fakulteti (bundan buyon — "Fakultet") talabalari, magistrantlari, stajyorlari, professor-o'qituvchilari va boshqa xodimlaridan (bundan buyon — "shikoyatchilar") kelib tushgan shikoyatlar, arizalar va takliflarni qabul qilish, ro'yxatga olish, ko'rib chiqish va hal qilish tartibini, ular bo'yicha qarorlar qabul qilishni belgilaydi hamda mas'ul organlar va mansabdor shaxslarning vakolatlarini aniqlaydi.</w:t>
       </w:r>
       <w:r>
         <w:rPr>
@@ -616,11 +610,8 @@
           <w:color w:val="2E74B5"/>
           <w:sz w:val="28"/>
         </w:rPr>
-        <w:t xml:space="preserve">CHAPTER 1. GENERAL PROVISIONS </w:t>
-      </w:r>
-      <w:r>
-        <w:br/>
-      </w:r>
+      </w:r>
+      <w:r/>
       <w:r>
         <w:rPr>
           <w:rFonts w:ascii="Arial" w:hAnsi="Arial" w:eastAsia="Arial"/>
@@ -629,11 +620,8 @@
           <w:color w:val="2E74B5"/>
           <w:sz w:val="28"/>
         </w:rPr>
-        <w:t xml:space="preserve">1.1. Purpose of the Guideline </w:t>
-      </w:r>
-      <w:r>
-        <w:br/>
-      </w:r>
+      </w:r>
+      <w:r/>
       <w:r>
         <w:rPr>
           <w:rFonts w:ascii="Arial" w:hAnsi="Arial" w:eastAsia="Arial"/>
@@ -642,7 +630,6 @@
           <w:color w:val="000000"/>
           <w:sz w:val="28"/>
         </w:rPr>
-        <w:t xml:space="preserve">1. This Guideline (hereinafter — the “Guideline”) establishes the </w:t>
       </w:r>
       <w:r>
         <w:rPr>
@@ -652,7 +639,6 @@
           <w:color w:val="000000"/>
           <w:sz w:val="28"/>
         </w:rPr>
-        <w:t xml:space="preserve">procedure for receiving, registering, reviewing and resolving complaints, </w:t>
       </w:r>
       <w:r>
         <w:rPr>
@@ -662,7 +648,6 @@
           <w:color w:val="000000"/>
           <w:sz w:val="28"/>
         </w:rPr>
-        <w:t xml:space="preserve">applications and proposals from students, master’s students, trainees, </w:t>
       </w:r>
       <w:r>
         <w:rPr>
@@ -672,7 +657,6 @@
           <w:color w:val="000000"/>
           <w:sz w:val="28"/>
         </w:rPr>
-        <w:t xml:space="preserve">faculty members and other staff (hereinafter — “complainants”) of the </w:t>
       </w:r>
       <w:r>
         <w:rPr>
@@ -682,7 +666,6 @@
           <w:color w:val="000000"/>
           <w:sz w:val="28"/>
         </w:rPr>
-        <w:t xml:space="preserve">Faculty of Physics and Mathematics of Termez State University (hereinafter </w:t>
       </w:r>
       <w:r>
         <w:rPr>
@@ -692,7 +675,6 @@
           <w:color w:val="000000"/>
           <w:sz w:val="28"/>
         </w:rPr>
-        <w:t xml:space="preserve">— the “Faculty”), for making decisions thereon, and defines the powers of </w:t>
       </w:r>
       <w:r>
         <w:rPr>
@@ -702,7 +684,6 @@
           <w:color w:val="000000"/>
           <w:sz w:val="28"/>
         </w:rPr>
-        <w:t xml:space="preserve">the responsible bodies and officials in this regard. </w:t>
       </w:r>
     </w:p>
     <w:p>
@@ -790,11 +771,11 @@
           <w:color w:val="2E74B5"/>
           <w:sz w:val="28"/>
         </w:rPr>
-        <w:t xml:space="preserve">1.2. Scope of Application </w:t>
-      </w:r>
-      <w:r>
+        <w:t xml:space="preserve">1.2. Qo'llanish doirasi </w:t>
         <w:br/>
-      </w:r>
+        <w:t>3. Yo'riqnoma qoidalari Fakultetning barcha tarkibiy bo'linmalariga — Umumiy va nazariy fizika, Amaliy fizika, Matematik tahlil, Algebra va geometriya hamda Amaliy matematika va informatika kafedralariga, shuningdek, o'quv laboratoriyalariga — va shikoyatchilarning barcha toifalariga, jumladan, bakalavr va magistratura talabalariga, stajyorlarga, professor-o'qituvchilarga hamda ilmiy va o'quv-yordamchi xodimlarga tatbiq etiladi.</w:t>
+      </w:r>
+      <w:r/>
       <w:r>
         <w:rPr>
           <w:rFonts w:ascii="Arial" w:hAnsi="Arial" w:eastAsia="Arial"/>
@@ -803,7 +784,6 @@
           <w:color w:val="000000"/>
           <w:sz w:val="28"/>
         </w:rPr>
-        <w:t xml:space="preserve">3. The provisions of the Guideline apply to all structural units of the </w:t>
       </w:r>
       <w:r>
         <w:rPr>
@@ -813,7 +793,6 @@
           <w:color w:val="000000"/>
           <w:sz w:val="28"/>
         </w:rPr>
-        <w:t xml:space="preserve">Faculty — the Departments of General and Theoretical Physics, Applied </w:t>
       </w:r>
       <w:r>
         <w:rPr>
@@ -823,7 +802,6 @@
           <w:color w:val="000000"/>
           <w:sz w:val="28"/>
         </w:rPr>
-        <w:t xml:space="preserve">Physics, Mathematical Analysis, Algebra and Geometry, and Applied </w:t>
       </w:r>
       <w:r>
         <w:rPr>
@@ -833,7 +811,6 @@
           <w:color w:val="000000"/>
           <w:sz w:val="28"/>
         </w:rPr>
-        <w:t xml:space="preserve">Mathematics and Informatics, as well as teaching laboratories — and to all </w:t>
       </w:r>
       <w:r>
         <w:rPr>
@@ -843,7 +820,6 @@
           <w:color w:val="000000"/>
           <w:sz w:val="28"/>
         </w:rPr>
-        <w:t xml:space="preserve">categories of complainants, including bachelor’s and master’s students, </w:t>
       </w:r>
       <w:r>
         <w:rPr>
@@ -853,7 +829,6 @@
           <w:color w:val="000000"/>
           <w:sz w:val="28"/>
         </w:rPr>
-        <w:t xml:space="preserve">trainees, faculty members, and research and teaching-support staff. </w:t>
       </w:r>
     </w:p>
     <w:p>
@@ -1045,11 +1020,25 @@
           <w:color w:val="2E74B5"/>
           <w:sz w:val="28"/>
         </w:rPr>
-        <w:t xml:space="preserve">1.3. Regulatory and Legal Basis </w:t>
-      </w:r>
-      <w:r>
+        <w:t xml:space="preserve">1.3. Me'yoriy-huquqiy asos </w:t>
         <w:br/>
-      </w:r>
+        <w:t xml:space="preserve">5. Yo'riqnoma quyidagi hujjatlar asosida ishlab chiqilgan: </w:t>
+        <w:br/>
+        <w:t xml:space="preserve">O'zbekiston Respublikasining "Ta'lim to'g'risida"gi Qonuni; </w:t>
+        <w:br/>
+        <w:t xml:space="preserve">O'zbekiston Respublikasining 2014-yil 3-sentyabrdagi O'RQ-378-sonli "Fuqarolarning murojaatlari to'g'risida"gi Qonuni; </w:t>
+        <w:br/>
+        <w:t xml:space="preserve">O'zbekiston Respublikasining Mehnat kodeksi; </w:t>
+        <w:br/>
+        <w:t xml:space="preserve">O'zbekiston Respublikasining "Shaxsga doir ma'lumotlar to'g'risida"gi Qonuni; </w:t>
+        <w:br/>
+        <w:t xml:space="preserve">O'zbekiston Respublikasi Prezidentining murojaatlarni ko'rib chiqish tizimini takomillashtirishga oid farmonlari va qarorlari, jumladan, "Xalq qabulxonalari" va "Ishonch telefoni" tizimlari bo'yicha me'yoriy hujjatlar; </w:t>
+        <w:br/>
+        <w:t xml:space="preserve">Oliy ta'lim, fan va innovatsiyalar vazirligi hamda O'zbekiston Respublikasi Prezidenti huzuridagi Ta'lim sifatini nazorat qilish davlat inspeksiyasining tegishli buyruqlari va yo'riqnomalari; </w:t>
+        <w:br/>
+        <w:t>ISO 10002:2018 xalqaro standarti "Sifat menejmenti —</w:t>
+      </w:r>
+      <w:r/>
       <w:r>
         <w:rPr>
           <w:rFonts w:ascii="Arial" w:hAnsi="Arial" w:eastAsia="Arial"/>
@@ -1058,7 +1047,6 @@
           <w:color w:val="000000"/>
           <w:sz w:val="28"/>
         </w:rPr>
-        <w:t xml:space="preserve">5. The Guideline has been developed on the basis of the following </w:t>
       </w:r>
       <w:r>
         <w:rPr>
@@ -1068,11 +1056,8 @@
           <w:color w:val="000000"/>
           <w:sz w:val="28"/>
         </w:rPr>
-        <w:t xml:space="preserve">documents: </w:t>
-      </w:r>
-      <w:r>
-        <w:br/>
-      </w:r>
+      </w:r>
+      <w:r/>
       <w:r>
         <w:rPr>
           <w:rFonts w:ascii="Arial" w:hAnsi="Arial" w:eastAsia="Arial"/>
@@ -1081,11 +1066,8 @@
           <w:color w:val="000000"/>
           <w:sz w:val="28"/>
         </w:rPr>
-        <w:t xml:space="preserve">the Law of the Republic of Uzbekistan “On Education”; </w:t>
-      </w:r>
-      <w:r>
-        <w:br/>
-      </w:r>
+      </w:r>
+      <w:r/>
       <w:r>
         <w:rPr>
           <w:rFonts w:ascii="Arial" w:hAnsi="Arial" w:eastAsia="Arial"/>
@@ -1094,7 +1076,6 @@
           <w:color w:val="000000"/>
           <w:sz w:val="28"/>
         </w:rPr>
-        <w:t xml:space="preserve">Law No. O‘RQ-378 of the Republic of Uzbekistan “On Citizens’ </w:t>
       </w:r>
       <w:r>
         <w:rPr>
@@ -1104,11 +1085,8 @@
           <w:color w:val="000000"/>
           <w:sz w:val="28"/>
         </w:rPr>
-        <w:t xml:space="preserve">Appeals,” dated 3 September 2014; </w:t>
-      </w:r>
-      <w:r>
-        <w:br/>
-      </w:r>
+      </w:r>
+      <w:r/>
       <w:r>
         <w:rPr>
           <w:rFonts w:ascii="Arial" w:hAnsi="Arial" w:eastAsia="Arial"/>
@@ -1117,11 +1095,8 @@
           <w:color w:val="000000"/>
           <w:sz w:val="28"/>
         </w:rPr>
-        <w:t xml:space="preserve">the Labour Code of the Republic of Uzbekistan; </w:t>
-      </w:r>
-      <w:r>
-        <w:br/>
-      </w:r>
+      </w:r>
+      <w:r/>
       <w:r>
         <w:rPr>
           <w:rFonts w:ascii="Arial" w:hAnsi="Arial" w:eastAsia="Arial"/>
@@ -1130,11 +1105,8 @@
           <w:color w:val="000000"/>
           <w:sz w:val="28"/>
         </w:rPr>
-        <w:t xml:space="preserve">the Law of the Republic of Uzbekistan “On Personal Data”; </w:t>
-      </w:r>
-      <w:r>
-        <w:br/>
-      </w:r>
+      </w:r>
+      <w:r/>
       <w:r>
         <w:rPr>
           <w:rFonts w:ascii="Arial" w:hAnsi="Arial" w:eastAsia="Arial"/>
@@ -1143,7 +1115,6 @@
           <w:color w:val="000000"/>
           <w:sz w:val="28"/>
         </w:rPr>
-        <w:t xml:space="preserve">decrees and resolutions of the President of the Republic of Uzbekistan </w:t>
       </w:r>
       <w:r>
         <w:rPr>
@@ -1153,7 +1124,6 @@
           <w:color w:val="000000"/>
           <w:sz w:val="28"/>
         </w:rPr>
-        <w:t xml:space="preserve">on improving the system for handling appeals, including the regulatory </w:t>
       </w:r>
       <w:r>
         <w:rPr>
@@ -1163,7 +1133,6 @@
           <w:color w:val="000000"/>
           <w:sz w:val="28"/>
         </w:rPr>
-        <w:t xml:space="preserve">documents on the “Public Reception Offices” and the “Trust Hotline” </w:t>
       </w:r>
       <w:r>
         <w:rPr>
@@ -1173,11 +1142,8 @@
           <w:color w:val="000000"/>
           <w:sz w:val="28"/>
         </w:rPr>
-        <w:t xml:space="preserve">systems; </w:t>
-      </w:r>
-      <w:r>
-        <w:br/>
-      </w:r>
+      </w:r>
+      <w:r/>
       <w:r>
         <w:rPr>
           <w:rFonts w:ascii="Arial" w:hAnsi="Arial" w:eastAsia="Arial"/>
@@ -1186,7 +1152,6 @@
           <w:color w:val="000000"/>
           <w:sz w:val="28"/>
         </w:rPr>
-        <w:t xml:space="preserve">the relevant orders and guidelines of the Ministry of Higher Education, </w:t>
       </w:r>
       <w:r>
         <w:rPr>
@@ -1196,7 +1161,6 @@
           <w:color w:val="000000"/>
           <w:sz w:val="28"/>
         </w:rPr>
-        <w:t xml:space="preserve">Science and Innovation and of the State Inspectorate for Quality Control in </w:t>
       </w:r>
       <w:r>
         <w:rPr>
@@ -1206,11 +1170,8 @@
           <w:color w:val="000000"/>
           <w:sz w:val="28"/>
         </w:rPr>
-        <w:t xml:space="preserve">Education under the President of the Republic of Uzbekistan; </w:t>
-      </w:r>
-      <w:r>
-        <w:br/>
-      </w:r>
+      </w:r>
+      <w:r/>
       <w:r>
         <w:rPr>
           <w:rFonts w:ascii="Arial" w:hAnsi="Arial" w:eastAsia="Arial"/>
@@ -1219,7 +1180,6 @@
           <w:color w:val="000000"/>
           <w:sz w:val="28"/>
         </w:rPr>
-        <w:t xml:space="preserve">the international standard ISO 10002:2018 “Quality management — </w:t>
       </w:r>
     </w:p>
     <w:tbl>
@@ -1505,11 +1465,15 @@
           <w:color w:val="000000"/>
           <w:sz w:val="28"/>
         </w:rPr>
-        <w:t xml:space="preserve">organizations”; </w:t>
-      </w:r>
-      <w:r>
+        <w:t xml:space="preserve">tashkilotlar"; </w:t>
         <w:br/>
-      </w:r>
+        <w:t xml:space="preserve">Yevropa oliy ta'lim makonida sifat ta'minlash standartlari va yo'riqnomalari (ESG, 2015-yil nashri), xususan, 1.1, 1.2, 1.3, 1.4, 1.7, 1.8 va 1.9-standartlar; </w:t>
+        <w:br/>
+        <w:t xml:space="preserve">QS World University Rankings va Times Higher Education (THE) reytinglarida ishtirok etuvchi, jumladan, TOP-300 ga kiruvchi xorijiy oliy ta'lim muassasalarining talabalar va xodimlar shikoyatlarini ko'rib chiqishdagi e'tirof etilgan amaliyoti; </w:t>
+        <w:br/>
+        <w:t>Termiz davlat universitetining Ustavi, uning Sifat ta'minlash siyosati va boshqa ichki me'yoriy hujjatlar.</w:t>
+      </w:r>
+      <w:r/>
       <w:r>
         <w:rPr>
           <w:rFonts w:ascii="Arial" w:hAnsi="Arial" w:eastAsia="Arial"/>
@@ -1518,7 +1482,6 @@
           <w:color w:val="000000"/>
           <w:sz w:val="28"/>
         </w:rPr>
-        <w:t xml:space="preserve">the Standards and Guidelines for Quality Assurance in the European </w:t>
       </w:r>
       <w:r>
         <w:rPr>
@@ -1528,7 +1491,6 @@
           <w:color w:val="000000"/>
           <w:sz w:val="28"/>
         </w:rPr>
-        <w:t xml:space="preserve">Higher Education Area (ESG, 2015 edition), in particular Standards 1.1, 1.2, </w:t>
       </w:r>
       <w:r>
         <w:rPr>
@@ -1538,11 +1500,8 @@
           <w:color w:val="000000"/>
           <w:sz w:val="28"/>
         </w:rPr>
-        <w:t xml:space="preserve">1.3, 1.4, 1.7, 1.8 and 1.9; </w:t>
-      </w:r>
-      <w:r>
-        <w:br/>
-      </w:r>
+      </w:r>
+      <w:r/>
       <w:r>
         <w:rPr>
           <w:rFonts w:ascii="Arial" w:hAnsi="Arial" w:eastAsia="Arial"/>
@@ -1551,7 +1510,6 @@
           <w:color w:val="000000"/>
           <w:sz w:val="28"/>
         </w:rPr>
-        <w:t xml:space="preserve">the recognized practice in handling student and staff complaints of </w:t>
       </w:r>
       <w:r>
         <w:rPr>
@@ -1561,7 +1519,6 @@
           <w:color w:val="000000"/>
           <w:sz w:val="28"/>
         </w:rPr>
-        <w:t xml:space="preserve">foreign higher education institutions participating in the QS World University </w:t>
       </w:r>
       <w:r>
         <w:rPr>
@@ -1571,7 +1528,6 @@
           <w:color w:val="000000"/>
           <w:sz w:val="28"/>
         </w:rPr>
-        <w:t xml:space="preserve">Rankings and Times Higher Education (THE) rankings, including those </w:t>
       </w:r>
       <w:r>
         <w:rPr>
@@ -1581,11 +1537,8 @@
           <w:color w:val="000000"/>
           <w:sz w:val="28"/>
         </w:rPr>
-        <w:t xml:space="preserve">within the TOP-300; </w:t>
-      </w:r>
-      <w:r>
-        <w:br/>
-      </w:r>
+      </w:r>
+      <w:r/>
       <w:r>
         <w:rPr>
           <w:rFonts w:ascii="Arial" w:hAnsi="Arial" w:eastAsia="Arial"/>
@@ -1594,7 +1547,6 @@
           <w:color w:val="000000"/>
           <w:sz w:val="28"/>
         </w:rPr>
-        <w:t xml:space="preserve">the Charter of Termez State University, its Quality Assurance Policy, </w:t>
       </w:r>
       <w:r>
         <w:rPr>
@@ -1604,7 +1556,6 @@
           <w:color w:val="000000"/>
           <w:sz w:val="28"/>
         </w:rPr>
-        <w:t xml:space="preserve">and other internal regulatory documents. </w:t>
       </w:r>
     </w:p>
     <w:p>
@@ -1690,7 +1641,7 @@
           <w:color w:val="000000"/>
           <w:sz w:val="28"/>
         </w:rPr>
-        <w:t>6. The Guideline is based on the internationally recognized “three-</w:t>
+        <w:t>6. Yo'riqnoma xalqaro miqyosda e'tirof etilgan "uch bosqichli" yondashuv (norasmiy hal qilish — rasmiy ko'rib chiqish — mustaqil qayta ko'rib chiqish) va ISO 10002 da belgilangan asosiy tamoyillarga asoslanadi (batafsil 13-bobda).</w:t>
       </w:r>
       <w:r>
         <w:rPr>
@@ -1700,7 +1651,6 @@
           <w:color w:val="000000"/>
           <w:sz w:val="28"/>
         </w:rPr>
-        <w:t>stage” approach (informal resolution — formal review — independent re-</w:t>
       </w:r>
       <w:r>
         <w:rPr>
@@ -1710,7 +1660,6 @@
           <w:color w:val="000000"/>
           <w:sz w:val="28"/>
         </w:rPr>
-        <w:t xml:space="preserve">review) and on the core principles set out in ISO 10002 (further detailed in </w:t>
       </w:r>
       <w:r>
         <w:rPr>
@@ -1720,7 +1669,6 @@
           <w:color w:val="000000"/>
           <w:sz w:val="28"/>
         </w:rPr>
-        <w:t xml:space="preserve">Chapter 13). </w:t>
       </w:r>
     </w:p>
     <w:p>
@@ -1743,11 +1691,25 @@
           <w:color w:val="2E74B5"/>
           <w:sz w:val="28"/>
         </w:rPr>
-        <w:t xml:space="preserve">1.4. Basic Concepts </w:t>
-      </w:r>
-      <w:r>
+        <w:t xml:space="preserve">1.4. Asosiy tushunchalar </w:t>
         <w:br/>
-      </w:r>
+        <w:t xml:space="preserve">7. Ushbu Yo'riqnomada quyidagi asosiy tushunchalar qo'llaniladi: </w:t>
+        <w:br/>
+        <w:t xml:space="preserve">shikoyat — shikoyatchining o'z huquqi, erkinligi yoki qonuniy manfaati buzilganligi yoki Fakultet xizmatlarining sifatidan noroziligi to'g'risidagi yozma yoki elektron murojaat; </w:t>
+        <w:br/>
+        <w:t xml:space="preserve">taklif — Fakultet faoliyatini yaxshilashga qaratilgan fikr; norasmiy shikoyat — rasmiy ro'yxatga olishsiz, bevosita muloqot orqali tezkor hal qilinadigan murojaat; </w:t>
+        <w:br/>
+        <w:t xml:space="preserve">rasmiy shikoyat — belgilangan shaklda topshirilgan, ro'yxatga olingan va ushbu Yo'riqnomada belgilangan muddatlarda ko'rib chiqilgan murojaat; apellyatsiya (qayta ko'rib chiqish so'rovi) — qabul qilingan qarorga rozi bo'lmagan shikoyatchining uni mustaqil qayta ko'rib chiqish to'g'risidagi so'rovi; </w:t>
+        <w:br/>
+        <w:t xml:space="preserve">mediatsiya — mustaqil vositachining ishtirokida nizolashuvchi tomonlar o'rtasidagi nizoni hal qilish usuli; </w:t>
+        <w:br/>
+        <w:t xml:space="preserve">Ombudsmen (Ishonch vakili) — talabalar va xodimlarning huquqlari va manfaatlarini himoya qilish uchun mas'ul mustaqil mansabdor shaxs; sifat sikli (PDCA — Rejalashtirish-Amalga oshirish-Tekshirish-Takomillashtirish) — ESG 1.1 va 1.9-standartlariga muvofiq, jarayonlarni rejalashtirish, amalga oshirish, tekshirish va takomillashtirish asosidagi uzluksiz takomillashtirish sikli; </w:t>
+        <w:br/>
+        <w:t xml:space="preserve">manfaatlar to'qnashuvi — shikoyatni ko'rib chiquvchi shaxsning shikoyat mavzusida shaxsiy, oilaviy yoki kasbiy manfaatdorligi mavjud bo'lgan holat; </w:t>
+        <w:br/>
+        <w:t>qasos chorasi (bosim) — shaxsning shikoyat berganligi yoki shikoyat berishda ishtirok etganligi sababli unga nisbatan ko'rilgan har qanday salbiy chora.</w:t>
+      </w:r>
+      <w:r/>
       <w:r>
         <w:rPr>
           <w:rFonts w:ascii="Arial" w:hAnsi="Arial" w:eastAsia="Arial"/>
@@ -1756,11 +1718,8 @@
           <w:color w:val="000000"/>
           <w:sz w:val="28"/>
         </w:rPr>
-        <w:t xml:space="preserve">7. The following basic concepts are used in this Guideline: </w:t>
-      </w:r>
-      <w:r>
-        <w:br/>
-      </w:r>
+      </w:r>
+      <w:r/>
       <w:r>
         <w:rPr>
           <w:rFonts w:ascii="Arial" w:hAnsi="Arial" w:eastAsia="Arial"/>
@@ -1769,7 +1728,6 @@
           <w:color w:val="000000"/>
           <w:sz w:val="28"/>
         </w:rPr>
-        <w:t xml:space="preserve">complaint — a written or electronic communication from a complainant </w:t>
       </w:r>
       <w:r>
         <w:rPr>
@@ -1779,7 +1737,6 @@
           <w:color w:val="000000"/>
           <w:sz w:val="28"/>
         </w:rPr>
-        <w:t xml:space="preserve">concerning a violation of their right, freedom or legitimate interest, or </w:t>
       </w:r>
       <w:r>
         <w:rPr>
@@ -1789,11 +1746,8 @@
           <w:color w:val="000000"/>
           <w:sz w:val="28"/>
         </w:rPr>
-        <w:t xml:space="preserve">dissatisfaction with the quality of the Faculty’s services; </w:t>
-      </w:r>
-      <w:r>
-        <w:br/>
-      </w:r>
+      </w:r>
+      <w:r/>
       <w:r>
         <w:rPr>
           <w:rFonts w:ascii="Arial" w:hAnsi="Arial" w:eastAsia="Arial"/>
@@ -1802,7 +1756,6 @@
           <w:color w:val="000000"/>
           <w:sz w:val="28"/>
         </w:rPr>
-        <w:t xml:space="preserve">proposal — an opinion aimed at improving the Faculty’s activities; </w:t>
       </w:r>
       <w:r>
         <w:rPr>
@@ -1812,7 +1765,6 @@
           <w:color w:val="000000"/>
           <w:sz w:val="28"/>
         </w:rPr>
-        <w:t xml:space="preserve">informal complaint — a communication resolved promptly through direct </w:t>
       </w:r>
       <w:r>
         <w:rPr>
@@ -1822,11 +1774,8 @@
           <w:color w:val="000000"/>
           <w:sz w:val="28"/>
         </w:rPr>
-        <w:t xml:space="preserve">communication, without formal registration; </w:t>
-      </w:r>
-      <w:r>
-        <w:br/>
-      </w:r>
+      </w:r>
+      <w:r/>
       <w:r>
         <w:rPr>
           <w:rFonts w:ascii="Arial" w:hAnsi="Arial" w:eastAsia="Arial"/>
@@ -1835,7 +1784,6 @@
           <w:color w:val="000000"/>
           <w:sz w:val="28"/>
         </w:rPr>
-        <w:t xml:space="preserve">formal complaint — a communication submitted in the prescribed form, </w:t>
       </w:r>
       <w:r>
         <w:rPr>
@@ -1845,7 +1793,6 @@
           <w:color w:val="000000"/>
           <w:sz w:val="28"/>
         </w:rPr>
-        <w:t xml:space="preserve">registered, and reviewed within the time limits specified in this Guideline; </w:t>
       </w:r>
       <w:r>
         <w:rPr>
@@ -1855,7 +1802,6 @@
           <w:color w:val="000000"/>
           <w:sz w:val="28"/>
         </w:rPr>
-        <w:t xml:space="preserve">appeal (request for re-review) — a request by a complainant who </w:t>
       </w:r>
       <w:r>
         <w:rPr>
@@ -1865,11 +1811,8 @@
           <w:color w:val="000000"/>
           <w:sz w:val="28"/>
         </w:rPr>
-        <w:t xml:space="preserve">disagrees with a decision taken, for its independent re-review; </w:t>
-      </w:r>
-      <w:r>
-        <w:br/>
-      </w:r>
+      </w:r>
+      <w:r/>
       <w:r>
         <w:rPr>
           <w:rFonts w:ascii="Arial" w:hAnsi="Arial" w:eastAsia="Arial"/>
@@ -1878,7 +1821,6 @@
           <w:color w:val="000000"/>
           <w:sz w:val="28"/>
         </w:rPr>
-        <w:t xml:space="preserve">mediation — a method of resolving a dispute between the disputing </w:t>
       </w:r>
       <w:r>
         <w:rPr>
@@ -1888,11 +1830,8 @@
           <w:color w:val="000000"/>
           <w:sz w:val="28"/>
         </w:rPr>
-        <w:t xml:space="preserve">parties with the participation of an independent intermediary; </w:t>
-      </w:r>
-      <w:r>
-        <w:br/>
-      </w:r>
+      </w:r>
+      <w:r/>
       <w:r>
         <w:rPr>
           <w:rFonts w:ascii="Arial" w:hAnsi="Arial" w:eastAsia="Arial"/>
@@ -1901,7 +1840,6 @@
           <w:color w:val="000000"/>
           <w:sz w:val="28"/>
         </w:rPr>
-        <w:t xml:space="preserve">Ombudsperson (Trust Representative) — an independent official </w:t>
       </w:r>
       <w:r>
         <w:rPr>
@@ -1911,7 +1849,6 @@
           <w:color w:val="000000"/>
           <w:sz w:val="28"/>
         </w:rPr>
-        <w:t xml:space="preserve">responsible for protecting the rights and interests of students and staff; </w:t>
       </w:r>
       <w:r>
         <w:rPr>
@@ -1921,7 +1858,6 @@
           <w:color w:val="000000"/>
           <w:sz w:val="28"/>
         </w:rPr>
-        <w:t xml:space="preserve">quality cycle (PDCA — Plan-Do-Check-Act) — in accordance with ESG </w:t>
       </w:r>
       <w:r>
         <w:rPr>
@@ -1931,7 +1867,6 @@
           <w:color w:val="000000"/>
           <w:sz w:val="28"/>
         </w:rPr>
-        <w:t xml:space="preserve">Standards 1.1 and 1.9, a continuous-improvement cycle based on planning, </w:t>
       </w:r>
       <w:r>
         <w:rPr>
@@ -1941,11 +1876,8 @@
           <w:color w:val="000000"/>
           <w:sz w:val="28"/>
         </w:rPr>
-        <w:t xml:space="preserve">implementing, checking and improving processes; </w:t>
-      </w:r>
-      <w:r>
-        <w:br/>
-      </w:r>
+      </w:r>
+      <w:r/>
       <w:r>
         <w:rPr>
           <w:rFonts w:ascii="Arial" w:hAnsi="Arial" w:eastAsia="Arial"/>
@@ -1954,7 +1886,6 @@
           <w:color w:val="000000"/>
           <w:sz w:val="28"/>
         </w:rPr>
-        <w:t xml:space="preserve">conflict of interest — a situation in which the person reviewing a </w:t>
       </w:r>
       <w:r>
         <w:rPr>
@@ -1964,7 +1895,6 @@
           <w:color w:val="000000"/>
           <w:sz w:val="28"/>
         </w:rPr>
-        <w:t xml:space="preserve">complaint has a personal, family, or professional interest in the subject </w:t>
       </w:r>
       <w:r>
         <w:rPr>
@@ -1974,11 +1904,8 @@
           <w:color w:val="000000"/>
           <w:sz w:val="28"/>
         </w:rPr>
-        <w:t xml:space="preserve">matter of the complaint; </w:t>
-      </w:r>
-      <w:r>
-        <w:br/>
-      </w:r>
+      </w:r>
+      <w:r/>
       <w:r>
         <w:rPr>
           <w:rFonts w:ascii="Arial" w:hAnsi="Arial" w:eastAsia="Arial"/>
@@ -1987,7 +1914,6 @@
           <w:color w:val="000000"/>
           <w:sz w:val="28"/>
         </w:rPr>
-        <w:t xml:space="preserve">reprisal (pressure) — any adverse measure taken against a person </w:t>
       </w:r>
       <w:r>
         <w:rPr>
@@ -1997,7 +1923,6 @@
           <w:color w:val="000000"/>
           <w:sz w:val="28"/>
         </w:rPr>
-        <w:t xml:space="preserve">because that person filed, or participated in filing, a complaint. </w:t>
       </w:r>
     </w:p>
     <w:p>
@@ -2106,7 +2031,9 @@
           <w:color w:val="000000"/>
           <w:sz w:val="28"/>
         </w:rPr>
-        <w:t xml:space="preserve">8. The complaints-handling system is based on the following principles </w:t>
+        <w:t xml:space="preserve">8. Shikoyatlarni ko'rib chiqish tizimi ISO 10002:2018 xalqaro standarti va ESG 1.1-standartida ("sifat ta'minlash siyosati va jarayonlari rasmiy maqomga ega bo'lishi, ommaviy ravishda ochiq bo'lishi va uzluksiz takomillashtirish siklining bir qismi bo'lishi lozim") belgilangan quyidagi tamoyillarga asoslanadi: </w:t>
+        <w:br/>
+        <w:t>Ochiqlik va shaffoflik — shikoyat berish tartibi, kanallari va muddatlari to'g'risidagi ma'lumotlar Fakultet veb-saytida, talabalar va xodimlar qo'llanmasida hamda barcha tarkibiy bo'linmalarda ommaviy ravishda e'lon qilinadi (ESG 1.8-standarti — jamoatchilikka ochiq ma'lumot).</w:t>
       </w:r>
       <w:r>
         <w:rPr>
@@ -2116,7 +2043,6 @@
           <w:color w:val="000000"/>
           <w:sz w:val="28"/>
         </w:rPr>
-        <w:t xml:space="preserve">established in the international standard ISO 10002:2018 and in ESG </w:t>
       </w:r>
       <w:r>
         <w:rPr>
@@ -2126,7 +2052,6 @@
           <w:color w:val="000000"/>
           <w:sz w:val="28"/>
         </w:rPr>
-        <w:t xml:space="preserve">Standard 1.1 (“policies and processes for quality assurance should have a </w:t>
       </w:r>
       <w:r>
         <w:rPr>
@@ -2136,7 +2061,6 @@
           <w:color w:val="000000"/>
           <w:sz w:val="28"/>
         </w:rPr>
-        <w:t xml:space="preserve">formal status and be publicly available, and should form part of a cycle of </w:t>
       </w:r>
       <w:r>
         <w:rPr>
@@ -2146,11 +2070,8 @@
           <w:color w:val="000000"/>
           <w:sz w:val="28"/>
         </w:rPr>
-        <w:t xml:space="preserve">continuous improvement”): </w:t>
-      </w:r>
-      <w:r>
-        <w:br/>
-      </w:r>
+      </w:r>
+      <w:r/>
       <w:r>
         <w:rPr>
           <w:rFonts w:ascii="Arial" w:hAnsi="Arial" w:eastAsia="Arial"/>
@@ -2159,7 +2080,6 @@
           <w:color w:val="000000"/>
           <w:sz w:val="28"/>
         </w:rPr>
-        <w:t xml:space="preserve">Openness and transparency — information on the procedure, channels </w:t>
       </w:r>
       <w:r>
         <w:rPr>
@@ -2169,7 +2089,6 @@
           <w:color w:val="000000"/>
           <w:sz w:val="28"/>
         </w:rPr>
-        <w:t xml:space="preserve">and time limits for filing a complaint is made publicly available on the Faculty </w:t>
       </w:r>
       <w:r>
         <w:rPr>
@@ -2179,7 +2098,6 @@
           <w:color w:val="000000"/>
           <w:sz w:val="28"/>
         </w:rPr>
-        <w:t xml:space="preserve">website, in the student and staff handbook, and in all structural units (ESG </w:t>
       </w:r>
       <w:r>
         <w:rPr>
@@ -2189,7 +2107,6 @@
           <w:color w:val="000000"/>
           <w:sz w:val="28"/>
         </w:rPr>
-        <w:t xml:space="preserve">Standard 1.8 — information open to the public). </w:t>
       </w:r>
     </w:p>
     <w:p>
@@ -2644,10 +2561,14 @@
       </w:pPr>
       <w:r>
         <w:tab/>
-      </w:r>
-      <w:r>
         <w:tab/>
-      </w:r>
+        <w:t xml:space="preserve">3-BOB. SHIKOYATLARNING TASNIFI </w:t>
+        <w:br/>
+        <w:t xml:space="preserve">3.1. Mavzusi bo'yicha </w:t>
+        <w:br/>
+        <w:t>ta'lim jarayoniga oid (baholash adolatliligi, imtihonlar va baholashlar o'tkazilishi, laboratoriya mashg'ulotlari, kurs ishlari/bitiruv malakaviy ishlariga ilmiy rahbarlik, o'quv dasturi);</w:t>
+      </w:r>
+      <w:r/>
       <w:r>
         <w:rPr>
           <w:rFonts w:ascii="Arial" w:hAnsi="Arial" w:eastAsia="Arial"/>
@@ -2656,11 +2577,8 @@
           <w:color w:val="2E74B5"/>
           <w:sz w:val="28"/>
         </w:rPr>
-        <w:t xml:space="preserve">CHAPTER 3. CLASSIFICATION OF COMPLAINTS </w:t>
-      </w:r>
-      <w:r>
-        <w:br/>
-      </w:r>
+      </w:r>
+      <w:r/>
       <w:r>
         <w:rPr>
           <w:rFonts w:ascii="Arial" w:hAnsi="Arial" w:eastAsia="Arial"/>
@@ -2669,11 +2587,8 @@
           <w:color w:val="2E74B5"/>
           <w:sz w:val="28"/>
         </w:rPr>
-        <w:t xml:space="preserve">3.1. By Subject Matter </w:t>
-      </w:r>
-      <w:r>
-        <w:br/>
-      </w:r>
+      </w:r>
+      <w:r/>
       <w:r>
         <w:rPr>
           <w:rFonts w:ascii="Arial" w:hAnsi="Arial" w:eastAsia="Arial"/>
@@ -2682,7 +2597,6 @@
           <w:color w:val="000000"/>
           <w:sz w:val="28"/>
         </w:rPr>
-        <w:t xml:space="preserve">related to the educational process (fairness of assessment, the conduct </w:t>
       </w:r>
       <w:r>
         <w:rPr>
@@ -2692,7 +2606,6 @@
           <w:color w:val="000000"/>
           <w:sz w:val="28"/>
         </w:rPr>
-        <w:t xml:space="preserve">of examinations and assessments, laboratory classes, academic supervision </w:t>
       </w:r>
       <w:r>
         <w:rPr>
@@ -2702,7 +2615,6 @@
           <w:color w:val="000000"/>
           <w:sz w:val="28"/>
         </w:rPr>
-        <w:t xml:space="preserve">of coursework/final qualifying papers, the curriculum); </w:t>
       </w:r>
     </w:p>
     <w:tbl>
@@ -2864,11 +2776,19 @@
           <w:color w:val="000000"/>
           <w:sz w:val="28"/>
         </w:rPr>
-        <w:t xml:space="preserve">workflow, transfer between departments); </w:t>
-      </w:r>
-      <w:r>
+        <w:t xml:space="preserve">ish yuritish, kafedralarararo o'tkazish); </w:t>
         <w:br/>
-      </w:r>
+        <w:t xml:space="preserve">mehnat munosabatlari (lavozimga tayinlash, ish haqi, intizomiy jazo, shartnoma shartlari) — professor-o'qituvchilar va xodimlar uchun; </w:t>
+        <w:br/>
+        <w:t xml:space="preserve">axloq normalari va hurmat buzilishi (kamsitish, bosim, zo'ravonlik, mobbing); </w:t>
+        <w:br/>
+        <w:t xml:space="preserve">korruptsiya belgilari (pora so'rash, adolatsiz munosabat, lavozimdan suiiste'mol qilish); </w:t>
+        <w:br/>
+        <w:t xml:space="preserve">infratuzilma va moddiy-texnik ta'minot (laboratoriya jihozlari, darsxona sharoitlari); </w:t>
+        <w:br/>
+        <w:t>boshqa masalalar.</w:t>
+      </w:r>
+      <w:r/>
       <w:r>
         <w:rPr>
           <w:rFonts w:ascii="Arial" w:hAnsi="Arial" w:eastAsia="Arial"/>
@@ -2877,7 +2797,6 @@
           <w:color w:val="000000"/>
           <w:sz w:val="28"/>
         </w:rPr>
-        <w:t xml:space="preserve">labour relations (appointment to a position, salary, disciplinary sanction, </w:t>
       </w:r>
       <w:r>
         <w:rPr>
@@ -2887,11 +2806,8 @@
           <w:color w:val="000000"/>
           <w:sz w:val="28"/>
         </w:rPr>
-        <w:t xml:space="preserve">contract terms) — for faculty members and staff; </w:t>
-      </w:r>
-      <w:r>
-        <w:br/>
-      </w:r>
+      </w:r>
+      <w:r/>
       <w:r>
         <w:rPr>
           <w:rFonts w:ascii="Arial" w:hAnsi="Arial" w:eastAsia="Arial"/>
@@ -2900,7 +2816,6 @@
           <w:color w:val="000000"/>
           <w:sz w:val="28"/>
         </w:rPr>
-        <w:t xml:space="preserve">violations of ethical norms and respect (discrimination, pressure, </w:t>
       </w:r>
       <w:r>
         <w:rPr>
@@ -2910,11 +2825,8 @@
           <w:color w:val="000000"/>
           <w:sz w:val="28"/>
         </w:rPr>
-        <w:t xml:space="preserve">bullying, mobbing); </w:t>
-      </w:r>
-      <w:r>
-        <w:br/>
-      </w:r>
+      </w:r>
+      <w:r/>
       <w:r>
         <w:rPr>
           <w:rFonts w:ascii="Arial" w:hAnsi="Arial" w:eastAsia="Arial"/>
@@ -2923,7 +2835,6 @@
           <w:color w:val="000000"/>
           <w:sz w:val="28"/>
         </w:rPr>
-        <w:t xml:space="preserve">indications of corruption (soliciting a bribe, unfair treatment, abuse of </w:t>
       </w:r>
       <w:r>
         <w:rPr>
@@ -2933,11 +2844,8 @@
           <w:color w:val="000000"/>
           <w:sz w:val="28"/>
         </w:rPr>
-        <w:t xml:space="preserve">position); </w:t>
-      </w:r>
-      <w:r>
-        <w:br/>
-      </w:r>
+      </w:r>
+      <w:r/>
       <w:r>
         <w:rPr>
           <w:rFonts w:ascii="Arial" w:hAnsi="Arial" w:eastAsia="Arial"/>
@@ -2946,7 +2854,6 @@
           <w:color w:val="000000"/>
           <w:sz w:val="28"/>
         </w:rPr>
-        <w:t xml:space="preserve">infrastructure and material-technical provision (laboratory equipment, </w:t>
       </w:r>
       <w:r>
         <w:rPr>
@@ -2956,11 +2863,8 @@
           <w:color w:val="000000"/>
           <w:sz w:val="28"/>
         </w:rPr>
-        <w:t xml:space="preserve">classroom conditions); </w:t>
-      </w:r>
-      <w:r>
-        <w:br/>
-      </w:r>
+      </w:r>
+      <w:r/>
       <w:r>
         <w:rPr>
           <w:rFonts w:ascii="Arial" w:hAnsi="Arial" w:eastAsia="Arial"/>
@@ -2969,7 +2873,6 @@
           <w:color w:val="000000"/>
           <w:sz w:val="28"/>
         </w:rPr>
-        <w:t xml:space="preserve">other matters. </w:t>
       </w:r>
     </w:p>
     <w:p>
@@ -2992,11 +2895,13 @@
           <w:color w:val="2E74B5"/>
           <w:sz w:val="28"/>
         </w:rPr>
-        <w:t xml:space="preserve">3.2. By Nature of Review (International Practice Classification) </w:t>
-      </w:r>
-      <w:r>
+        <w:t xml:space="preserve">3.2. Ko'rib chiqish xarakteri bo'yicha (xalqaro amaliyot tasnifi) </w:t>
         <w:br/>
-      </w:r>
+        <w:t xml:space="preserve">nizolar — ma'muriy qarorlar, baholash yoki xizmat sifati bo'yicha kelishmovchiliklar; </w:t>
+        <w:br/>
+        <w:t>noto'g'ri boshqaruv — asossiz qarorlar, qoidalarning nomuvofiq qo'llanilishi, adolatsizlik;</w:t>
+      </w:r>
+      <w:r/>
       <w:r>
         <w:rPr>
           <w:rFonts w:ascii="Arial" w:hAnsi="Arial" w:eastAsia="Arial"/>
@@ -3005,7 +2910,6 @@
           <w:color w:val="000000"/>
           <w:sz w:val="28"/>
         </w:rPr>
-        <w:t xml:space="preserve">disputes — disagreements regarding administrative decisions, </w:t>
       </w:r>
       <w:r>
         <w:rPr>
@@ -3015,11 +2919,8 @@
           <w:color w:val="000000"/>
           <w:sz w:val="28"/>
         </w:rPr>
-        <w:t xml:space="preserve">assessment, or service quality; </w:t>
-      </w:r>
-      <w:r>
-        <w:br/>
-      </w:r>
+      </w:r>
+      <w:r/>
       <w:r>
         <w:rPr>
           <w:rFonts w:ascii="Arial" w:hAnsi="Arial" w:eastAsia="Arial"/>
@@ -3028,7 +2929,6 @@
           <w:color w:val="000000"/>
           <w:sz w:val="28"/>
         </w:rPr>
-        <w:t xml:space="preserve">mismanagement — unjustified decisions, inconsistent application of </w:t>
       </w:r>
       <w:r>
         <w:rPr>
@@ -3038,7 +2938,6 @@
           <w:color w:val="000000"/>
           <w:sz w:val="28"/>
         </w:rPr>
-        <w:t xml:space="preserve">rules, unfairness; </w:t>
       </w:r>
     </w:p>
     <w:p>
@@ -3159,11 +3058,15 @@
           <w:color w:val="2E74B5"/>
           <w:sz w:val="28"/>
         </w:rPr>
-        <w:t xml:space="preserve">3.3. By Authorship </w:t>
-      </w:r>
-      <w:r>
+        <w:t xml:space="preserve">3.3. Mualliflik bo'yicha </w:t>
         <w:br/>
-      </w:r>
+        <w:t xml:space="preserve">yakka tartibdagi shikoyat; </w:t>
+        <w:br/>
+        <w:t xml:space="preserve">jamoaviy shikoyat; </w:t>
+        <w:br/>
+        <w:t>anonim shikoyat — faqat qonunning jiddiy buzilishi belgilari yoki xavfsizlikka tahdid mavjud bo'lganda, Dekan qarori bilan alohida tartibda ko'rib chiqilishi mumkin.</w:t>
+      </w:r>
+      <w:r/>
       <w:r>
         <w:rPr>
           <w:rFonts w:ascii="Arial" w:hAnsi="Arial" w:eastAsia="Arial"/>
@@ -3172,11 +3075,8 @@
           <w:color w:val="000000"/>
           <w:sz w:val="28"/>
         </w:rPr>
-        <w:t xml:space="preserve">individual complaint; </w:t>
-      </w:r>
-      <w:r>
-        <w:br/>
-      </w:r>
+      </w:r>
+      <w:r/>
       <w:r>
         <w:rPr>
           <w:rFonts w:ascii="Arial" w:hAnsi="Arial" w:eastAsia="Arial"/>
@@ -3185,11 +3085,8 @@
           <w:color w:val="000000"/>
           <w:sz w:val="28"/>
         </w:rPr>
-        <w:t xml:space="preserve">collective complaint; </w:t>
-      </w:r>
-      <w:r>
-        <w:br/>
-      </w:r>
+      </w:r>
+      <w:r/>
       <w:r>
         <w:rPr>
           <w:rFonts w:ascii="Arial" w:hAnsi="Arial" w:eastAsia="Arial"/>
@@ -3198,7 +3095,6 @@
           <w:color w:val="000000"/>
           <w:sz w:val="28"/>
         </w:rPr>
-        <w:t xml:space="preserve">anonymous complaint — may be reviewed under a separate procedure </w:t>
       </w:r>
       <w:r>
         <w:rPr>
@@ -3208,7 +3104,6 @@
           <w:color w:val="000000"/>
           <w:sz w:val="28"/>
         </w:rPr>
-        <w:t xml:space="preserve">by decision of the Dean, only where there are indications of a serious </w:t>
       </w:r>
       <w:r>
         <w:rPr>
@@ -3218,7 +3113,6 @@
           <w:color w:val="000000"/>
           <w:sz w:val="28"/>
         </w:rPr>
-        <w:t xml:space="preserve">violation of the law or a threat to safety. </w:t>
       </w:r>
     </w:p>
     <w:p>
@@ -3236,10 +3130,18 @@
       </w:pPr>
       <w:r>
         <w:tab/>
-      </w:r>
-      <w:r>
         <w:tab/>
-      </w:r>
+        <w:t xml:space="preserve">4-BOB. SHIKOYATLARNI QABUL QILISH KANALLARI 9. Shikoyatchilarga quyidagi kanallar orqali shikoyat berish imkoniyati taqdim etiladi: </w:t>
+        <w:br/>
+        <w:t xml:space="preserve">Termiz davlat universiteti va Fizika va matematika fakultetining rasmiy Telegram boti; </w:t>
+        <w:br/>
+        <w:t xml:space="preserve">Dekanatning shikoyatlar uchun maxsus elektron pochta manzili; Ishonch telefoni; </w:t>
+        <w:br/>
+        <w:t xml:space="preserve">dekan, dekan o'rinbosarlari va kafedra mudirlarining belgilangan haftalik qabul soatlari (jadval Fakultet binosida va veb-saytda ommaviy ravishda joylashtirilgan); </w:t>
+        <w:br/>
+        <w:t>Fakultet Talabalar kengashi va Kasaba uyushmasi tashkiloti orqali; Fakultet binosida joylashtirilgan "Takliflar qutisi".</w:t>
+      </w:r>
+      <w:r/>
       <w:r>
         <w:rPr>
           <w:rFonts w:ascii="Arial" w:hAnsi="Arial" w:eastAsia="Arial"/>
@@ -3248,7 +3150,6 @@
           <w:color w:val="2E74B5"/>
           <w:sz w:val="28"/>
         </w:rPr>
-        <w:t xml:space="preserve">CHAPTER 4. CHANNELS FOR RECEIVING COMPLAINTS </w:t>
       </w:r>
       <w:r>
         <w:rPr>
@@ -3258,7 +3159,6 @@
           <w:color w:val="000000"/>
           <w:sz w:val="28"/>
         </w:rPr>
-        <w:t xml:space="preserve">9. Complainants are provided with the opportunity to file a complaint </w:t>
       </w:r>
       <w:r>
         <w:rPr>
@@ -3268,11 +3168,8 @@
           <w:color w:val="000000"/>
           <w:sz w:val="28"/>
         </w:rPr>
-        <w:t xml:space="preserve">through the following channels: </w:t>
-      </w:r>
-      <w:r>
-        <w:br/>
-      </w:r>
+      </w:r>
+      <w:r/>
       <w:r>
         <w:rPr>
           <w:rFonts w:ascii="Arial" w:hAnsi="Arial" w:eastAsia="Arial"/>
@@ -3281,7 +3178,6 @@
           <w:color w:val="000000"/>
           <w:sz w:val="28"/>
         </w:rPr>
-        <w:t xml:space="preserve">the official Telegram bot of Termez State University and the Faculty of </w:t>
       </w:r>
       <w:r>
         <w:rPr>
@@ -3291,11 +3187,8 @@
           <w:color w:val="000000"/>
           <w:sz w:val="28"/>
         </w:rPr>
-        <w:t xml:space="preserve">Physics and Mathematics; </w:t>
-      </w:r>
-      <w:r>
-        <w:br/>
-      </w:r>
+      </w:r>
+      <w:r/>
       <w:r>
         <w:rPr>
           <w:rFonts w:ascii="Arial" w:hAnsi="Arial" w:eastAsia="Arial"/>
@@ -3304,7 +3197,6 @@
           <w:color w:val="000000"/>
           <w:sz w:val="28"/>
         </w:rPr>
-        <w:t xml:space="preserve">the dedicated e-mail address of the Dean’s Office for complaints; </w:t>
       </w:r>
       <w:r>
         <w:rPr>
@@ -3314,11 +3206,8 @@
           <w:color w:val="000000"/>
           <w:sz w:val="28"/>
         </w:rPr>
-        <w:t xml:space="preserve">the Trust Hotline; </w:t>
-      </w:r>
-      <w:r>
-        <w:br/>
-      </w:r>
+      </w:r>
+      <w:r/>
       <w:r>
         <w:rPr>
           <w:rFonts w:ascii="Arial" w:hAnsi="Arial" w:eastAsia="Arial"/>
@@ -3327,7 +3216,6 @@
           <w:color w:val="000000"/>
           <w:sz w:val="28"/>
         </w:rPr>
-        <w:t xml:space="preserve">the established weekly reception hours of the dean, deputy deans, and </w:t>
       </w:r>
       <w:r>
         <w:rPr>
@@ -3337,7 +3225,6 @@
           <w:color w:val="000000"/>
           <w:sz w:val="28"/>
         </w:rPr>
-        <w:t xml:space="preserve">heads of department (the schedule is publicly displayed at the Faculty </w:t>
       </w:r>
       <w:r>
         <w:rPr>
@@ -3347,11 +3234,8 @@
           <w:color w:val="000000"/>
           <w:sz w:val="28"/>
         </w:rPr>
-        <w:t xml:space="preserve">building and on the website); </w:t>
-      </w:r>
-      <w:r>
-        <w:br/>
-      </w:r>
+      </w:r>
+      <w:r/>
       <w:r>
         <w:rPr>
           <w:rFonts w:ascii="Arial" w:hAnsi="Arial" w:eastAsia="Arial"/>
@@ -3360,7 +3244,6 @@
           <w:color w:val="000000"/>
           <w:sz w:val="28"/>
         </w:rPr>
-        <w:t xml:space="preserve">through the Faculty Student Council and the Trade Union organization; </w:t>
       </w:r>
       <w:r>
         <w:rPr>
@@ -3370,7 +3253,6 @@
           <w:color w:val="000000"/>
           <w:sz w:val="28"/>
         </w:rPr>
-        <w:t xml:space="preserve">the “Suggestion Box” located at the Faculty building. </w:t>
       </w:r>
     </w:p>
     <w:p>
@@ -3426,10 +3308,10 @@
       </w:pPr>
       <w:r>
         <w:tab/>
-      </w:r>
-      <w:r>
         <w:tab/>
-      </w:r>
+        <w:t>5-BOB. MAS'UL ORGANLAR VA SHAXSLAR 5.1. Dekanat huzuridagi shikoyatlar va sifat ta'minlash guruhi 11. Dekanat huzurida dekan o'rinbosari boshchiligidagi Shikoyatlar va sifat ta'minlash guruhi (bundan buyon — "Guruh") faoliyat yuritadi. Guruh barcha shikoyatlarni ro'yxatga oladi, elektron reestrni yuritadi, muddatlarga rioya etilishini nazorat qiladi, statistik tahlil tayyorlaydi va natijalarni Fakultet sifat ta'minlash tizimiga kiritish uchun taqdim etadi.</w:t>
+      </w:r>
+      <w:r/>
       <w:r>
         <w:rPr>
           <w:rFonts w:ascii="Arial" w:hAnsi="Arial" w:eastAsia="Arial"/>
@@ -3438,7 +3320,6 @@
           <w:color w:val="2E74B5"/>
           <w:sz w:val="28"/>
         </w:rPr>
-        <w:t xml:space="preserve">CHAPTER 5. RESPONSIBLE BODIES AND PERSONS </w:t>
       </w:r>
       <w:r>
         <w:rPr>
@@ -3448,7 +3329,6 @@
           <w:color w:val="2E74B5"/>
           <w:sz w:val="28"/>
         </w:rPr>
-        <w:t xml:space="preserve">5.1. Complaints and Quality Assurance Group under the Dean’s Office </w:t>
       </w:r>
       <w:r>
         <w:rPr>
@@ -3458,7 +3338,6 @@
           <w:color w:val="000000"/>
           <w:sz w:val="28"/>
         </w:rPr>
-        <w:t xml:space="preserve">11. A Complaints and Quality Assurance Group (hereinafter — the </w:t>
       </w:r>
       <w:r>
         <w:rPr>
@@ -3468,7 +3347,6 @@
           <w:color w:val="000000"/>
           <w:sz w:val="28"/>
         </w:rPr>
-        <w:t xml:space="preserve">“Group”), headed by the Deputy Dean, operates under the Dean’s Office. </w:t>
       </w:r>
       <w:r>
         <w:rPr>
@@ -3478,7 +3356,6 @@
           <w:color w:val="000000"/>
           <w:sz w:val="28"/>
         </w:rPr>
-        <w:t xml:space="preserve">The Group registers all complaints, maintains an electronic register, monitors </w:t>
       </w:r>
       <w:r>
         <w:rPr>
@@ -3488,7 +3365,6 @@
           <w:color w:val="000000"/>
           <w:sz w:val="28"/>
         </w:rPr>
-        <w:t xml:space="preserve">compliance with time limits, prepares statistical analysis, and submits the </w:t>
       </w:r>
       <w:r>
         <w:rPr>
@@ -3498,7 +3374,6 @@
           <w:color w:val="000000"/>
           <w:sz w:val="28"/>
         </w:rPr>
-        <w:t xml:space="preserve">results for inclusion in the Faculty Quality Assurance system. </w:t>
       </w:r>
     </w:p>
     <w:p>
@@ -3587,11 +3462,11 @@
           <w:color w:val="2E74B5"/>
           <w:sz w:val="28"/>
         </w:rPr>
-        <w:t xml:space="preserve">5.2. Faculty Ombudsperson (Trust Representative) </w:t>
-      </w:r>
-      <w:r>
+        <w:t xml:space="preserve">5.2. Fakultet ombudsmeni (Ishonch vakili) </w:t>
         <w:br/>
-      </w:r>
+        <w:t>12. Talabalar va xodimlarning huquqlari va manfaatlarini himoya qilish uchun Fakultet ombudsmeni lavozimi ta'sis etilgan. Ombudsmen o'z faoliyatida mustaqil bo'lib, bevosita Fakultet kengashiga hisobdor,</w:t>
+      </w:r>
+      <w:r/>
       <w:r>
         <w:rPr>
           <w:rFonts w:ascii="Arial" w:hAnsi="Arial" w:eastAsia="Arial"/>
@@ -3600,7 +3475,6 @@
           <w:color w:val="000000"/>
           <w:sz w:val="28"/>
         </w:rPr>
-        <w:t xml:space="preserve">12. A Faculty Ombudsperson position is established for the protection </w:t>
       </w:r>
       <w:r>
         <w:rPr>
@@ -3610,7 +3484,6 @@
           <w:color w:val="000000"/>
           <w:sz w:val="28"/>
         </w:rPr>
-        <w:t xml:space="preserve">of the rights and interests of students and staff. The Ombudsperson is </w:t>
       </w:r>
       <w:r>
         <w:rPr>
@@ -3620,7 +3493,6 @@
           <w:color w:val="000000"/>
           <w:sz w:val="28"/>
         </w:rPr>
-        <w:t xml:space="preserve">independent in their activities, is directly accountable to the Faculty Council, </w:t>
       </w:r>
     </w:p>
     <w:tbl>
@@ -3864,11 +3736,11 @@
           <w:color w:val="2E74B5"/>
           <w:sz w:val="28"/>
         </w:rPr>
-        <w:t xml:space="preserve">5.3. Responsible Persons at Department Level </w:t>
-      </w:r>
-      <w:r>
+        <w:t xml:space="preserve">5.3. Kafedra darajasidagi mas'ul shaxslar </w:t>
         <w:br/>
-      </w:r>
+        <w:t>13. Tegishli kafedra mudiri (Umumiy va nazariy fizika, Amaliy fizika, Matematik tahlil, Algebra va geometriya, Amaliy matematika va informatika va boshqa kafedralar) o'z kafedrasiga oid birinchi darajali shikoyatlarni (norasmiy va dastlabki rasmiy) ko'rib chiqadi.</w:t>
+      </w:r>
+      <w:r/>
       <w:r>
         <w:rPr>
           <w:rFonts w:ascii="Arial" w:hAnsi="Arial" w:eastAsia="Arial"/>
@@ -3877,7 +3749,6 @@
           <w:color w:val="000000"/>
           <w:sz w:val="28"/>
         </w:rPr>
-        <w:t xml:space="preserve">13. The head of the relevant department (General and Theoretical </w:t>
       </w:r>
       <w:r>
         <w:rPr>
@@ -3887,7 +3758,6 @@
           <w:color w:val="000000"/>
           <w:sz w:val="28"/>
         </w:rPr>
-        <w:t xml:space="preserve">Physics, Applied Physics, Mathematical Analysis, Algebra and Geometry, </w:t>
       </w:r>
       <w:r>
         <w:rPr>
@@ -3897,7 +3767,6 @@
           <w:color w:val="000000"/>
           <w:sz w:val="28"/>
         </w:rPr>
-        <w:t>Applied Mathematics and Informatics, and other departments) reviews first-</w:t>
       </w:r>
       <w:r>
         <w:rPr>
@@ -3907,7 +3776,6 @@
           <w:color w:val="000000"/>
           <w:sz w:val="28"/>
         </w:rPr>
-        <w:t xml:space="preserve">level complaints (informal and initial formal) relating to their department. </w:t>
       </w:r>
     </w:p>
     <w:p>
@@ -4275,11 +4143,11 @@
           <w:color w:val="2E74B5"/>
           <w:sz w:val="28"/>
         </w:rPr>
-        <w:t xml:space="preserve">5.5. Faculty Appeals Committee </w:t>
-      </w:r>
-      <w:r>
+        <w:t xml:space="preserve">5.5. Fakultet apellyatsiya qo'mitasi </w:t>
         <w:br/>
-      </w:r>
+        <w:t>15. Shikoyatchi dastlabki qarorga e'tiroz bildirgan shikoyatlarni ko'rib chiqish uchun Fakultet apellyatsiya qo'mitasi tashkil etiladi. Uning a'zolari dastlabki qarorni qabul qilishda ishtirok etmagan shaxslardir (ushbu Yo'riqnomaning 3-ilovasiga qarang).</w:t>
+      </w:r>
+      <w:r/>
       <w:r>
         <w:rPr>
           <w:rFonts w:ascii="Arial" w:hAnsi="Arial" w:eastAsia="Arial"/>
@@ -4288,7 +4156,6 @@
           <w:color w:val="000000"/>
           <w:sz w:val="28"/>
         </w:rPr>
-        <w:t xml:space="preserve">15. A Faculty Appeals Committee is formed to consider complaints </w:t>
       </w:r>
       <w:r>
         <w:rPr>
@@ -4298,7 +4165,6 @@
           <w:color w:val="000000"/>
           <w:sz w:val="28"/>
         </w:rPr>
-        <w:t xml:space="preserve">against which the complainant disputes the initial decision. Its members are </w:t>
       </w:r>
       <w:r>
         <w:rPr>
@@ -4308,7 +4174,6 @@
           <w:color w:val="000000"/>
           <w:sz w:val="28"/>
         </w:rPr>
-        <w:t xml:space="preserve">persons who did not participate in the initial decision (see Annex 3 to this </w:t>
       </w:r>
       <w:r>
         <w:rPr>
@@ -4318,7 +4183,6 @@
           <w:color w:val="000000"/>
           <w:sz w:val="28"/>
         </w:rPr>
-        <w:t xml:space="preserve">Guideline). </w:t>
       </w:r>
     </w:p>
     <w:p>
@@ -4341,11 +4205,11 @@
           <w:color w:val="2E74B5"/>
           <w:sz w:val="28"/>
         </w:rPr>
-        <w:t xml:space="preserve">5.6. University Trade Union Committee </w:t>
-      </w:r>
-      <w:r>
+        <w:t xml:space="preserve">5.6. Universitet kasaba uyushmasi qo'mitasi </w:t>
         <w:br/>
-      </w:r>
+        <w:t>16. Kamsitish, bosim va boshqa jiddiy axloqiy buzilishlarga oid, fakultet darajasida hal qilinmagan shikoyatlar Universitet kasaba uyushmasi qo'mitasi tomonidan alohida tartibda ko'rib chiqiladi.</w:t>
+      </w:r>
+      <w:r/>
       <w:r>
         <w:rPr>
           <w:rFonts w:ascii="Arial" w:hAnsi="Arial" w:eastAsia="Arial"/>
@@ -4354,7 +4218,6 @@
           <w:color w:val="000000"/>
           <w:sz w:val="28"/>
         </w:rPr>
-        <w:t xml:space="preserve">16. Complaints concerning discrimination, pressure, and other serious </w:t>
       </w:r>
       <w:r>
         <w:rPr>
@@ -4364,7 +4227,6 @@
           <w:color w:val="000000"/>
           <w:sz w:val="28"/>
         </w:rPr>
-        <w:t xml:space="preserve">ethical violations that have not been resolved at faculty level are reviewed </w:t>
       </w:r>
       <w:r>
         <w:rPr>
@@ -4374,7 +4236,6 @@
           <w:color w:val="000000"/>
           <w:sz w:val="28"/>
         </w:rPr>
-        <w:t xml:space="preserve">under a separate procedure by the University Trade Union Committee. </w:t>
       </w:r>
     </w:p>
     <w:p>
@@ -4480,7 +4341,7 @@
           <w:color w:val="000000"/>
           <w:sz w:val="28"/>
         </w:rPr>
-        <w:t xml:space="preserve">17. The Dean of the Faculty bears ultimate responsibility, at faculty level, </w:t>
+        <w:t>17. Fakultet dekani fakultet darajasida shikoyatlarni ko'rib chiqish tizimining samarali ishlashi, uning zarur resurslar bilan ta'minlanishi, xalqaro va milliy talablarga muvofiq kelishi hamda tizim natijalarining boshqaruv qarorlarida hisobga olinishini ta'minlash uchun yakuniy javobgarlikni o'z zimmasiga oladi; Dekan murakkab ishlarni Universitet rektoratiga yo'naltiradi.</w:t>
       </w:r>
       <w:r>
         <w:rPr>
@@ -4490,7 +4351,6 @@
           <w:color w:val="000000"/>
           <w:sz w:val="28"/>
         </w:rPr>
-        <w:t xml:space="preserve">for the effective operation of the complaints-handling system, its provision </w:t>
       </w:r>
       <w:r>
         <w:rPr>
@@ -4500,7 +4360,6 @@
           <w:color w:val="000000"/>
           <w:sz w:val="28"/>
         </w:rPr>
-        <w:t xml:space="preserve">with the necessary resources, its compliance with international and national </w:t>
       </w:r>
       <w:r>
         <w:rPr>
@@ -4510,7 +4369,6 @@
           <w:color w:val="000000"/>
           <w:sz w:val="28"/>
         </w:rPr>
-        <w:t xml:space="preserve">requirements, and for ensuring that the system’s results are taken into </w:t>
       </w:r>
       <w:r>
         <w:rPr>
@@ -4520,7 +4378,6 @@
           <w:color w:val="000000"/>
           <w:sz w:val="28"/>
         </w:rPr>
-        <w:t xml:space="preserve">account in management decisions; the Dean refers complex cases to the </w:t>
       </w:r>
       <w:r>
         <w:rPr>
@@ -4530,7 +4387,6 @@
           <w:color w:val="000000"/>
           <w:sz w:val="28"/>
         </w:rPr>
-        <w:t xml:space="preserve">University Rectorate. </w:t>
       </w:r>
     </w:p>
     <w:p>
@@ -4549,10 +4405,18 @@
       </w:pPr>
       <w:r>
         <w:tab/>
-      </w:r>
-      <w:r>
         <w:tab/>
-      </w:r>
+        <w:t xml:space="preserve">6-BOB. SHIKOYATLARNI KO'RIB CHIQISH </w:t>
+        <w:tab/>
+        <w:tab/>
+        <w:tab/>
+        <w:t xml:space="preserve">TARTIBI VA BOSQICHLARI </w:t>
+        <w:br/>
+        <w:t xml:space="preserve">6.1. 1-bosqich. Norasmiy (tezkor) hal qilish </w:t>
+        <w:br/>
+        <w:t>18. Shikoyatchiga avval masalani tegishli kafedra mudiri yoki o'qituvchi bilan bevosita norasmiy muloqot orqali hal qilish imkoniyati taqdim etiladi. Ushbu bosqich 5 ish kuni ichida amalga oshiriladi va rasmiy ro'yxatga olishni talab qilmaydi. Zarur hollarda Fakultet ombudsmeni mediatsiya xizmatini ko'rsatadi.</w:t>
+      </w:r>
+      <w:r/>
       <w:r>
         <w:rPr>
           <w:rFonts w:ascii="Arial" w:hAnsi="Arial" w:eastAsia="Arial"/>
@@ -4561,17 +4425,10 @@
           <w:color w:val="2E74B5"/>
           <w:sz w:val="28"/>
         </w:rPr>
-        <w:t xml:space="preserve">CHAPTER 6. PROCEDURE AND STAGES FOR REVIEWING </w:t>
-      </w:r>
-      <w:r>
-        <w:tab/>
-      </w:r>
-      <w:r>
-        <w:tab/>
-      </w:r>
-      <w:r>
-        <w:tab/>
-      </w:r>
+      </w:r>
+      <w:r/>
+      <w:r/>
+      <w:r/>
       <w:r>
         <w:rPr>
           <w:rFonts w:ascii="Arial" w:hAnsi="Arial" w:eastAsia="Arial"/>
@@ -4580,11 +4437,8 @@
           <w:color w:val="2E74B5"/>
           <w:sz w:val="28"/>
         </w:rPr>
-        <w:t xml:space="preserve">COMPLAINTS </w:t>
-      </w:r>
-      <w:r>
-        <w:br/>
-      </w:r>
+      </w:r>
+      <w:r/>
       <w:r>
         <w:rPr>
           <w:rFonts w:ascii="Arial" w:hAnsi="Arial" w:eastAsia="Arial"/>
@@ -4593,11 +4447,8 @@
           <w:color w:val="2E74B5"/>
           <w:sz w:val="28"/>
         </w:rPr>
-        <w:t xml:space="preserve">6.1. Stage 1. Informal (Prompt) Resolution </w:t>
-      </w:r>
-      <w:r>
-        <w:br/>
-      </w:r>
+      </w:r>
+      <w:r/>
       <w:r>
         <w:rPr>
           <w:rFonts w:ascii="Arial" w:hAnsi="Arial" w:eastAsia="Arial"/>
@@ -4606,7 +4457,6 @@
           <w:color w:val="000000"/>
           <w:sz w:val="28"/>
         </w:rPr>
-        <w:t xml:space="preserve">18. The complainant is first offered the opportunity to resolve the matter </w:t>
       </w:r>
       <w:r>
         <w:rPr>
@@ -4616,7 +4466,6 @@
           <w:color w:val="000000"/>
           <w:sz w:val="28"/>
         </w:rPr>
-        <w:t xml:space="preserve">through informal communication directly with the relevant head of </w:t>
       </w:r>
       <w:r>
         <w:rPr>
@@ -4626,7 +4475,6 @@
           <w:color w:val="000000"/>
           <w:sz w:val="28"/>
         </w:rPr>
-        <w:t xml:space="preserve">department or lecturer. This stage is carried out within 5 working days and </w:t>
       </w:r>
       <w:r>
         <w:rPr>
@@ -4636,7 +4484,6 @@
           <w:color w:val="000000"/>
           <w:sz w:val="28"/>
         </w:rPr>
-        <w:t xml:space="preserve">does not require formal registration. Where necessary, the Faculty </w:t>
       </w:r>
       <w:r>
         <w:rPr>
@@ -4646,7 +4493,6 @@
           <w:color w:val="000000"/>
           <w:sz w:val="28"/>
         </w:rPr>
-        <w:t xml:space="preserve">Ombudsperson provides mediation. </w:t>
       </w:r>
     </w:p>
     <w:p>
@@ -4669,11 +4515,11 @@
           <w:color w:val="2E74B5"/>
           <w:sz w:val="28"/>
         </w:rPr>
-        <w:t xml:space="preserve">6.2. Stage 2. Filing and Registration of a Formal Complaint </w:t>
-      </w:r>
-      <w:r>
+        <w:t xml:space="preserve">6.2. 2-bosqich. Rasmiy shikoyatni topshirish va ro'yxatga olish </w:t>
         <w:br/>
-      </w:r>
+        <w:t>19. Norasmiy yo'l bilan hal qilinmagan yoki o'z xarakteri bo'yicha bevosita rasmiy tartibni talab qiladigan shikoyat belgilangan shaklda (1-ilova) yozma yoki elektron tarzda topshiriladi. U Fakultet kengashi kotibi tomonidan 1 ish kuni ichida ro'yxatga olinadi va shikoyatchiga ro'yxatga olish raqami va qabul qilinganlik haqida 3 ish kuni ichida xabar beriladi.</w:t>
+      </w:r>
+      <w:r/>
       <w:r>
         <w:rPr>
           <w:rFonts w:ascii="Arial" w:hAnsi="Arial" w:eastAsia="Arial"/>
@@ -4682,7 +4528,6 @@
           <w:color w:val="000000"/>
           <w:sz w:val="28"/>
         </w:rPr>
-        <w:t xml:space="preserve">19. A complaint that has not been resolved informally, or that by its </w:t>
       </w:r>
       <w:r>
         <w:rPr>
@@ -4692,7 +4537,6 @@
           <w:color w:val="000000"/>
           <w:sz w:val="28"/>
         </w:rPr>
-        <w:t xml:space="preserve">nature requires a formal procedure directly, is submitted in writing or </w:t>
       </w:r>
       <w:r>
         <w:rPr>
@@ -4702,7 +4546,6 @@
           <w:color w:val="000000"/>
           <w:sz w:val="28"/>
         </w:rPr>
-        <w:t xml:space="preserve">electronically in the prescribed form (Annex 1). It is registered by the </w:t>
       </w:r>
       <w:r>
         <w:rPr>
@@ -4712,7 +4555,6 @@
           <w:color w:val="000000"/>
           <w:sz w:val="28"/>
         </w:rPr>
-        <w:t xml:space="preserve">Secretary of the Faculty Council within 1 working day, and the complainant </w:t>
       </w:r>
       <w:r>
         <w:rPr>
@@ -4722,7 +4564,6 @@
           <w:color w:val="000000"/>
           <w:sz w:val="28"/>
         </w:rPr>
-        <w:t xml:space="preserve">is notified of the registration number and of its acceptance within 3 working </w:t>
       </w:r>
       <w:r>
         <w:rPr>
@@ -4732,7 +4573,6 @@
           <w:color w:val="000000"/>
           <w:sz w:val="28"/>
         </w:rPr>
-        <w:t xml:space="preserve">days. </w:t>
       </w:r>
     </w:p>
     <w:p>
@@ -4755,11 +4595,11 @@
           <w:color w:val="2E74B5"/>
           <w:sz w:val="28"/>
         </w:rPr>
-        <w:t xml:space="preserve">6.3. Stage 3. Preliminary Review </w:t>
-      </w:r>
-      <w:r>
+        <w:t xml:space="preserve">6.3. 3-bosqich. Dastlabki ko'rib chiqish </w:t>
         <w:br/>
-      </w:r>
+        <w:t>20. 5 ish kuni ichida shikoyat uning dolzarbligi, to'liqligi va manfaatlar to'qnashuvining yo'qligi bo'yicha dastlabki ko'rib chiqishdan o'tkaziladi va mazmuniga ko'ra mas'ul organga (Fakultet kengashiga) yo'naltiriladi.</w:t>
+      </w:r>
+      <w:r/>
       <w:r>
         <w:rPr>
           <w:rFonts w:ascii="Arial" w:hAnsi="Arial" w:eastAsia="Arial"/>
@@ -4768,7 +4608,6 @@
           <w:color w:val="000000"/>
           <w:sz w:val="28"/>
         </w:rPr>
-        <w:t xml:space="preserve">20. Within 5 working days, the complaint undergoes a preliminary review </w:t>
       </w:r>
       <w:r>
         <w:rPr>
@@ -4778,7 +4617,6 @@
           <w:color w:val="000000"/>
           <w:sz w:val="28"/>
         </w:rPr>
-        <w:t xml:space="preserve">as to its relevance, completeness, and the absence of a conflict of interest, </w:t>
       </w:r>
       <w:r>
         <w:rPr>
@@ -4788,7 +4626,6 @@
           <w:color w:val="000000"/>
           <w:sz w:val="28"/>
         </w:rPr>
-        <w:t xml:space="preserve">and is forwarded, according to its content, to the responsible body (the </w:t>
       </w:r>
       <w:r>
         <w:rPr>
@@ -4798,7 +4635,6 @@
           <w:color w:val="000000"/>
           <w:sz w:val="28"/>
         </w:rPr>
-        <w:t xml:space="preserve">Faculty Council). </w:t>
       </w:r>
     </w:p>
     <w:p>
@@ -4821,11 +4657,11 @@
           <w:color w:val="2E74B5"/>
           <w:sz w:val="28"/>
         </w:rPr>
-        <w:t xml:space="preserve">6.4. Stage 4. Investigation </w:t>
-      </w:r>
-      <w:r>
+        <w:t xml:space="preserve">6.4. 4-bosqich. Tekshirish </w:t>
         <w:br/>
-      </w:r>
+        <w:t>21. Shikoyat 15 ish kuni ichida mohiyatan ko'rib chiqiladi. Qo'shimcha hujjatlar yoki ma'lumotlarni talab qiladigan murakkab hollarda, ushbu muddat Guruh rahbari yoki dekan o'rinbosarining asoslangan qarori bilan</w:t>
+      </w:r>
+      <w:r/>
       <w:r>
         <w:rPr>
           <w:rFonts w:ascii="Arial" w:hAnsi="Arial" w:eastAsia="Arial"/>
@@ -4834,7 +4670,6 @@
           <w:color w:val="000000"/>
           <w:sz w:val="28"/>
         </w:rPr>
-        <w:t xml:space="preserve">21. The complaint is reviewed on its merits within 15 working days. In </w:t>
       </w:r>
       <w:r>
         <w:rPr>
@@ -4844,7 +4679,6 @@
           <w:color w:val="000000"/>
           <w:sz w:val="28"/>
         </w:rPr>
-        <w:t xml:space="preserve">complex cases requiring additional documents or information, this period </w:t>
       </w:r>
       <w:r>
         <w:rPr>
@@ -4854,7 +4688,6 @@
           <w:color w:val="000000"/>
           <w:sz w:val="28"/>
         </w:rPr>
-        <w:t xml:space="preserve">may, by a reasoned decision of the Head of the Group or the Deputy Dean </w:t>
       </w:r>
     </w:p>
     <w:p>
@@ -4940,7 +4773,7 @@
           <w:color w:val="000000"/>
           <w:sz w:val="28"/>
         </w:rPr>
-        <w:t xml:space="preserve">and in accordance with the Law “On Citizens’ Appeals,” be extended by up </w:t>
+        <w:t>va "Fuqarolarning murojaatlari to'g'risida"gi Qonunga muvofiq, qo'shimcha 30 ish kunigacha uzaytirilishi mumkin, bu haqda shikoyatchiga yozma ravishda xabar beriladi. Tekshirish davomida barcha manfaatdor tomonlardan tushuntirishlar olinadi va tegishli hujjatlar o'rganiladi.</w:t>
       </w:r>
       <w:r>
         <w:rPr>
@@ -4950,7 +4783,6 @@
           <w:color w:val="000000"/>
           <w:sz w:val="28"/>
         </w:rPr>
-        <w:t xml:space="preserve">to a further 30 working days, of which the complainant is notified in writing. </w:t>
       </w:r>
       <w:r>
         <w:rPr>
@@ -4960,7 +4792,6 @@
           <w:color w:val="000000"/>
           <w:sz w:val="28"/>
         </w:rPr>
-        <w:t xml:space="preserve">During the investigation, explanations are obtained from all parties </w:t>
       </w:r>
       <w:r>
         <w:rPr>
@@ -4970,7 +4801,6 @@
           <w:color w:val="000000"/>
           <w:sz w:val="28"/>
         </w:rPr>
-        <w:t xml:space="preserve">concerned and the relevant documents are examined. </w:t>
       </w:r>
     </w:p>
     <w:p>
@@ -4993,11 +4823,11 @@
           <w:color w:val="2E74B5"/>
           <w:sz w:val="28"/>
         </w:rPr>
-        <w:t xml:space="preserve">6.5. Stage 5. Decision-Making and Notification </w:t>
-      </w:r>
-      <w:r>
+        <w:t xml:space="preserve">6.5. 5-bosqich. Qaror qabul qilish va xabardor qilish </w:t>
         <w:br/>
-      </w:r>
+        <w:t>22. Tekshirish yakunlangach, asoslangan yozma qaror qabul qilinadi va qaror chiqarilgan kundan boshlab 3 ish kuni ichida shikoyatchiga topshiriladi. Qarorda apellyatsiya berish huquqi, tartibi va muddati ko'rsatilishi lozim.</w:t>
+      </w:r>
+      <w:r/>
       <w:r>
         <w:rPr>
           <w:rFonts w:ascii="Arial" w:hAnsi="Arial" w:eastAsia="Arial"/>
@@ -5006,7 +4836,6 @@
           <w:color w:val="000000"/>
           <w:sz w:val="28"/>
         </w:rPr>
-        <w:t xml:space="preserve">22. Following the conclusion of the investigation, a reasoned written </w:t>
       </w:r>
       <w:r>
         <w:rPr>
@@ -5016,7 +4845,6 @@
           <w:color w:val="000000"/>
           <w:sz w:val="28"/>
         </w:rPr>
-        <w:t xml:space="preserve">decision is adopted and delivered to the complainant within 3 working days </w:t>
       </w:r>
       <w:r>
         <w:rPr>
@@ -5026,7 +4854,6 @@
           <w:color w:val="000000"/>
           <w:sz w:val="28"/>
         </w:rPr>
-        <w:t xml:space="preserve">from the date the decision is issued. The decision must indicate the right, </w:t>
       </w:r>
       <w:r>
         <w:rPr>
@@ -5036,7 +4863,6 @@
           <w:color w:val="000000"/>
           <w:sz w:val="28"/>
         </w:rPr>
-        <w:t xml:space="preserve">procedure, and time limit for filing an appeal. </w:t>
       </w:r>
     </w:p>
     <w:p>
@@ -5059,11 +4885,11 @@
           <w:color w:val="2E74B5"/>
           <w:sz w:val="28"/>
         </w:rPr>
-        <w:t xml:space="preserve">6.6. Stage 6. Appeal (Re-Review) </w:t>
-      </w:r>
-      <w:r>
+        <w:t xml:space="preserve">6.6. 6-bosqich. Apellyatsiya (qayta ko'rib chiqish) </w:t>
         <w:br/>
-      </w:r>
+        <w:t>23. Shikoyatchi qaror bilan tanishgan kundan boshlab 10 ish kuni ichida Fakultet apellyatsiya qo'mitasiga murojaat qilish huquqiga ega. Apellyatsiya quyidagi asoslarda berilishi mumkin: protsessual buzilish, muhim yangi dalillarning mavjudligi yoki qarorning aniq asossizligi. Apellyatsiya qo'mitasi 20 ish kuni ichida yakuniy qaror qabul qiladi. Shikoyatchi Qo'mita yig'ilishida ishtirok etish va vakil (hamroh) yordamidan foydalanish huquqiga ega.</w:t>
+      </w:r>
+      <w:r/>
       <w:r>
         <w:rPr>
           <w:rFonts w:ascii="Arial" w:hAnsi="Arial" w:eastAsia="Arial"/>
@@ -5072,7 +4898,6 @@
           <w:color w:val="000000"/>
           <w:sz w:val="28"/>
         </w:rPr>
-        <w:t xml:space="preserve">23. The complainant has the right to apply to the Faculty Appeals </w:t>
       </w:r>
       <w:r>
         <w:rPr>
@@ -5082,7 +4907,6 @@
           <w:color w:val="000000"/>
           <w:sz w:val="28"/>
         </w:rPr>
-        <w:t xml:space="preserve">Committee within 10 working days from the day they become acquainted </w:t>
       </w:r>
       <w:r>
         <w:rPr>
@@ -5092,7 +4916,6 @@
           <w:color w:val="000000"/>
           <w:sz w:val="28"/>
         </w:rPr>
-        <w:t xml:space="preserve">with the decision. An appeal may be filed on the following grounds: a </w:t>
       </w:r>
       <w:r>
         <w:rPr>
@@ -5102,7 +4925,6 @@
           <w:color w:val="000000"/>
           <w:sz w:val="28"/>
         </w:rPr>
-        <w:t xml:space="preserve">procedural violation, the existence of significant new evidence, or manifest </w:t>
       </w:r>
       <w:r>
         <w:rPr>
@@ -5112,7 +4934,6 @@
           <w:color w:val="000000"/>
           <w:sz w:val="28"/>
         </w:rPr>
-        <w:t xml:space="preserve">unreasonableness of the decision. The Appeals Committee adopts a final </w:t>
       </w:r>
       <w:r>
         <w:rPr>
@@ -5122,7 +4943,6 @@
           <w:color w:val="000000"/>
           <w:sz w:val="28"/>
         </w:rPr>
-        <w:t xml:space="preserve">decision within 20 working days. The complainant has the right to attend the </w:t>
       </w:r>
       <w:r>
         <w:rPr>
@@ -5132,7 +4952,6 @@
           <w:color w:val="000000"/>
           <w:sz w:val="28"/>
         </w:rPr>
-        <w:t xml:space="preserve">Committee’s meeting and to be assisted by a representative (companion). </w:t>
       </w:r>
     </w:p>
     <w:p>
@@ -5155,11 +4974,15 @@
           <w:color w:val="2E74B5"/>
           <w:sz w:val="28"/>
         </w:rPr>
-        <w:t xml:space="preserve">6.7. Stage 7. Referral to External (Independent) Bodies </w:t>
-      </w:r>
-      <w:r>
+        <w:t xml:space="preserve">6.7. 7-bosqich. Tashqi (mustaqil) organlarga murojaat </w:t>
         <w:br/>
-      </w:r>
+        <w:t xml:space="preserve">24. Fakultet va Universitetning ichki protseduralarini yakunlagandan so'ng shikoyatchi natijadan norozi bo'lsa, quyidagi tashqi organlarga murojaat qilish huquqiga ega: Oliy ta'lim, fan va innovatsiyalar vazirligi; </w:t>
+        <w:br/>
+        <w:t xml:space="preserve">O'zbekiston Respublikasi Oliy Majlisi huzuridagi Inson huquqlari bo'yicha vakil (Ombudsman); </w:t>
+        <w:br/>
+        <w:t>sudlar — qonun hujjatlarida belgilangan tartibda.</w:t>
+      </w:r>
+      <w:r/>
       <w:r>
         <w:rPr>
           <w:rFonts w:ascii="Arial" w:hAnsi="Arial" w:eastAsia="Arial"/>
@@ -5168,7 +4991,6 @@
           <w:color w:val="000000"/>
           <w:sz w:val="28"/>
         </w:rPr>
-        <w:t xml:space="preserve">24. Where, after the internal procedures of the Faculty and the </w:t>
       </w:r>
       <w:r>
         <w:rPr>
@@ -5178,7 +5000,6 @@
           <w:color w:val="000000"/>
           <w:sz w:val="28"/>
         </w:rPr>
-        <w:t xml:space="preserve">University have been completed, the complainant remains dissatisfied with </w:t>
       </w:r>
       <w:r>
         <w:rPr>
@@ -5188,7 +5009,6 @@
           <w:color w:val="000000"/>
           <w:sz w:val="28"/>
         </w:rPr>
-        <w:t xml:space="preserve">the outcome, they have the right to apply to the following external bodies: </w:t>
       </w:r>
       <w:r>
         <w:rPr>
@@ -5198,11 +5018,8 @@
           <w:color w:val="000000"/>
           <w:sz w:val="28"/>
         </w:rPr>
-        <w:t xml:space="preserve">the Ministry of Higher Education, Science and Innovation; </w:t>
-      </w:r>
-      <w:r>
-        <w:br/>
-      </w:r>
+      </w:r>
+      <w:r/>
       <w:r>
         <w:rPr>
           <w:rFonts w:ascii="Arial" w:hAnsi="Arial" w:eastAsia="Arial"/>
@@ -5211,7 +5028,6 @@
           <w:color w:val="000000"/>
           <w:sz w:val="28"/>
         </w:rPr>
-        <w:t xml:space="preserve">the Commissioner for Human Rights (Ombudsman) under the Oliy </w:t>
       </w:r>
       <w:r>
         <w:rPr>
@@ -5221,11 +5037,8 @@
           <w:color w:val="000000"/>
           <w:sz w:val="28"/>
         </w:rPr>
-        <w:t xml:space="preserve">Majlis of the Republic of Uzbekistan; </w:t>
-      </w:r>
-      <w:r>
-        <w:br/>
-      </w:r>
+      </w:r>
+      <w:r/>
       <w:r>
         <w:rPr>
           <w:rFonts w:ascii="Arial" w:hAnsi="Arial" w:eastAsia="Arial"/>
@@ -5234,7 +5047,6 @@
           <w:color w:val="000000"/>
           <w:sz w:val="28"/>
         </w:rPr>
-        <w:t xml:space="preserve">the courts — in the manner established by legislation. </w:t>
       </w:r>
     </w:p>
     <w:p>
@@ -5254,7 +5066,7 @@
           <w:color w:val="000000"/>
           <w:sz w:val="28"/>
         </w:rPr>
-        <w:t xml:space="preserve">25. The University provides the complainant with an official letter (a </w:t>
+        <w:t>25. Universitet shikoyatchiga ichki protseduralar yakunlanganligi to'g'risida rasmiy xat (yakunlash xati) taqdim etadi — ushbu hujjat tashqi organlarga murojaat qilish uchun asos bo'lib xizmat qiladi (xalqaro miqyosda e'tirof etilgan "Protseduralarni yakunlash" amaliyotiga muvofiq).</w:t>
       </w:r>
       <w:r>
         <w:rPr>
@@ -5264,7 +5076,6 @@
           <w:color w:val="000000"/>
           <w:sz w:val="28"/>
         </w:rPr>
-        <w:t xml:space="preserve">completion letter) confirming that the internal procedures have been </w:t>
       </w:r>
       <w:r>
         <w:rPr>
@@ -5274,7 +5085,6 @@
           <w:color w:val="000000"/>
           <w:sz w:val="28"/>
         </w:rPr>
-        <w:t xml:space="preserve">completed — this document serves as the basis for applying to external </w:t>
       </w:r>
       <w:r>
         <w:rPr>
@@ -5284,7 +5094,6 @@
           <w:color w:val="000000"/>
           <w:sz w:val="28"/>
         </w:rPr>
-        <w:t xml:space="preserve">bodies (in accordance with the internationally recognized “Completion of </w:t>
       </w:r>
       <w:r>
         <w:rPr>
@@ -5294,7 +5103,6 @@
           <w:color w:val="000000"/>
           <w:sz w:val="28"/>
         </w:rPr>
-        <w:t xml:space="preserve">Procedures” practice). </w:t>
       </w:r>
     </w:p>
     <w:p>
@@ -5378,10 +5186,12 @@
       </w:pPr>
       <w:r>
         <w:tab/>
-      </w:r>
-      <w:r>
         <w:tab/>
-      </w:r>
+        <w:t xml:space="preserve">7-BOB. MUDDATLAR JADVALI </w:t>
+        <w:br/>
+        <w:t>26. Shikoyatni ko'rib chiqish bosqichlari va ularning belgilangan muddatlari quyidagi jadvalda jamlangan:</w:t>
+      </w:r>
+      <w:r/>
       <w:r>
         <w:rPr>
           <w:rFonts w:ascii="Arial" w:hAnsi="Arial" w:eastAsia="Arial"/>
@@ -5390,11 +5200,8 @@
           <w:color w:val="2E74B5"/>
           <w:sz w:val="28"/>
         </w:rPr>
-        <w:t xml:space="preserve">CHAPTER 7. TIMETABLE OF DEADLINES </w:t>
-      </w:r>
-      <w:r>
-        <w:br/>
-      </w:r>
+      </w:r>
+      <w:r/>
       <w:r>
         <w:rPr>
           <w:rFonts w:ascii="Arial" w:hAnsi="Arial" w:eastAsia="Arial"/>
@@ -5403,7 +5210,6 @@
           <w:color w:val="000000"/>
           <w:sz w:val="28"/>
         </w:rPr>
-        <w:t xml:space="preserve">26. The stages of complaint review and their established deadlines are </w:t>
       </w:r>
       <w:r>
         <w:rPr>
@@ -5413,7 +5219,6 @@
           <w:color w:val="000000"/>
           <w:sz w:val="28"/>
         </w:rPr>
-        <w:t xml:space="preserve">summarized in the table below: </w:t>
       </w:r>
     </w:p>
     <w:tbl>
@@ -6748,6 +6553,13 @@
       </w:pPr>
       <w:r>
         <w:tab/>
+        <w:t xml:space="preserve">8-BOB. MAXFIYLIK VA SHAXSIY </w:t>
+        <w:tab/>
+        <w:tab/>
+        <w:tab/>
+        <w:t xml:space="preserve">MA'LUMOTLARNI HIMOYA QILISH </w:t>
+        <w:br/>
+        <w:t>28. Shikoyat bilan bog'liq to'plangan barcha ma'lumotlar, jumladan, shikoyatchi va unda nomlari tilga olingan shaxslar haqidagi ma'lumotlar faqat tekshirish uchun zarur darajada va faqat jarayonga bevosita jalb qilingan mansabdor shaxslarga oshkor qilinadi.</w:t>
       </w:r>
       <w:r>
         <w:rPr>
@@ -6757,17 +6569,10 @@
           <w:color w:val="2E74B5"/>
           <w:sz w:val="28"/>
         </w:rPr>
-        <w:t xml:space="preserve">CHAPTER 8. CONFIDENTIALITY AND PROTECTION OF </w:t>
-      </w:r>
-      <w:r>
-        <w:tab/>
-      </w:r>
-      <w:r>
-        <w:tab/>
-      </w:r>
-      <w:r>
-        <w:tab/>
-      </w:r>
+      </w:r>
+      <w:r/>
+      <w:r/>
+      <w:r/>
       <w:r>
         <w:rPr>
           <w:rFonts w:ascii="Arial" w:hAnsi="Arial" w:eastAsia="Arial"/>
@@ -6776,11 +6581,8 @@
           <w:color w:val="2E74B5"/>
           <w:sz w:val="28"/>
         </w:rPr>
-        <w:t xml:space="preserve">PERSONAL DATA </w:t>
-      </w:r>
-      <w:r>
-        <w:br/>
-      </w:r>
+      </w:r>
+      <w:r/>
       <w:r>
         <w:rPr>
           <w:rFonts w:ascii="Arial" w:hAnsi="Arial" w:eastAsia="Arial"/>
@@ -6789,7 +6591,6 @@
           <w:color w:val="000000"/>
           <w:sz w:val="28"/>
         </w:rPr>
-        <w:t xml:space="preserve">28. All information gathered in connection with a complaint, including </w:t>
       </w:r>
       <w:r>
         <w:rPr>
@@ -6799,7 +6600,6 @@
           <w:color w:val="000000"/>
           <w:sz w:val="28"/>
         </w:rPr>
-        <w:t xml:space="preserve">information about the complainant and any persons named in it, is disclosed </w:t>
       </w:r>
       <w:r>
         <w:rPr>
@@ -6809,7 +6609,6 @@
           <w:color w:val="000000"/>
           <w:sz w:val="28"/>
         </w:rPr>
-        <w:t xml:space="preserve">only to the extent necessary for the investigation and only to officials directly </w:t>
       </w:r>
       <w:r>
         <w:rPr>
@@ -6819,7 +6618,6 @@
           <w:color w:val="000000"/>
           <w:sz w:val="28"/>
         </w:rPr>
-        <w:t xml:space="preserve">involved in the process. </w:t>
       </w:r>
     </w:p>
     <w:p>
@@ -6905,7 +6703,7 @@
           <w:color w:val="000000"/>
           <w:sz w:val="28"/>
         </w:rPr>
-        <w:t xml:space="preserve">29. The requirements of the Law of the Republic of Uzbekistan “On </w:t>
+        <w:t>29. Shaxsga doir ma'lumotlarni qayta ishlashda O'zbekiston Respublikasining "Shaxsga doir ma'lumotlar to'g'risida"gi Qonuni talablariga qat'iy rioya qilinadi. Shikoyatlarning elektron reestri ruxsatsiz kirishdan himoya bilan yuritiladi.</w:t>
       </w:r>
       <w:r>
         <w:rPr>
@@ -6915,7 +6713,6 @@
           <w:color w:val="000000"/>
           <w:sz w:val="28"/>
         </w:rPr>
-        <w:t xml:space="preserve">Personal Data” are strictly observed when handling personal data. The </w:t>
       </w:r>
       <w:r>
         <w:rPr>
@@ -6925,7 +6722,6 @@
           <w:color w:val="000000"/>
           <w:sz w:val="28"/>
         </w:rPr>
-        <w:t xml:space="preserve">electronic register of complaints is maintained with protection against </w:t>
       </w:r>
       <w:r>
         <w:rPr>
@@ -6935,7 +6731,6 @@
           <w:color w:val="000000"/>
           <w:sz w:val="28"/>
         </w:rPr>
-        <w:t xml:space="preserve">unauthorized access. </w:t>
       </w:r>
     </w:p>
     <w:p>
@@ -6955,7 +6750,7 @@
           <w:color w:val="000000"/>
           <w:sz w:val="28"/>
         </w:rPr>
-        <w:t xml:space="preserve">30. The possibility of keeping the complainant’s name confidential may </w:t>
+        <w:t>30. Shikoyatchining ismini maxfiy saqlash imkoniyati ko'rib chiqilishi mumkin, bunda bu tekshiruvning adolatliligini ta'minlash zaruriyati bilan zid kelmasligi shart; bunday hollarda yakuniy qaror ob'yektiv dalillarga asoslangan bo'lishi kerak.</w:t>
       </w:r>
       <w:r>
         <w:rPr>
@@ -6965,7 +6760,6 @@
           <w:color w:val="000000"/>
           <w:sz w:val="28"/>
         </w:rPr>
-        <w:t xml:space="preserve">be considered, provided that this does not conflict with the need to ensure </w:t>
       </w:r>
       <w:r>
         <w:rPr>
@@ -6975,7 +6769,6 @@
           <w:color w:val="000000"/>
           <w:sz w:val="28"/>
         </w:rPr>
-        <w:t xml:space="preserve">the fairness of the investigation; in such cases, the final decision must be </w:t>
       </w:r>
       <w:r>
         <w:rPr>
@@ -6985,7 +6778,6 @@
           <w:color w:val="000000"/>
           <w:sz w:val="28"/>
         </w:rPr>
-        <w:t xml:space="preserve">based on objective evidence. </w:t>
       </w:r>
     </w:p>
     <w:p>
@@ -7003,10 +6795,10 @@
       </w:pPr>
       <w:r>
         <w:tab/>
-      </w:r>
-      <w:r>
         <w:tab/>
-      </w:r>
+        <w:t>9-BOB. BOSIM VA QASOS CHORALARIDAN HIMOYA 31. Vijdonan shikoyat bergan yoki uni ko'rib chiqishda ishtirok etgan (guvohlik bergan) shaxsga nisbatan lavozimini pasaytirish, intizomiy jazo, bahoni pasaytirish, o'qishdan chetlash tahdidi yoki boshqa har qanday bosim yoki kamsitish shaklida chora ko'rish qat'iyan taqiqlanadi.</w:t>
+      </w:r>
+      <w:r/>
       <w:r>
         <w:rPr>
           <w:rFonts w:ascii="Arial" w:hAnsi="Arial" w:eastAsia="Arial"/>
@@ -7015,7 +6807,6 @@
           <w:color w:val="2E74B5"/>
           <w:sz w:val="28"/>
         </w:rPr>
-        <w:t xml:space="preserve">CHAPTER 9. PROTECTION FROM PRESSURE AND REPRISAL </w:t>
       </w:r>
       <w:r>
         <w:rPr>
@@ -7025,7 +6816,6 @@
           <w:color w:val="000000"/>
           <w:sz w:val="28"/>
         </w:rPr>
-        <w:t xml:space="preserve">31. Any measure in the form of demotion, disciplinary sanction, lowering </w:t>
       </w:r>
       <w:r>
         <w:rPr>
@@ -7035,7 +6825,6 @@
           <w:color w:val="000000"/>
           <w:sz w:val="28"/>
         </w:rPr>
-        <w:t xml:space="preserve">of a grade, threat of expulsion, or any other form of pressure or discrimination </w:t>
       </w:r>
       <w:r>
         <w:rPr>
@@ -7045,7 +6834,6 @@
           <w:color w:val="000000"/>
           <w:sz w:val="28"/>
         </w:rPr>
-        <w:t xml:space="preserve">against a person who has, in good faith, filed a complaint or participated in </w:t>
       </w:r>
       <w:r>
         <w:rPr>
@@ -7055,7 +6843,6 @@
           <w:color w:val="000000"/>
           <w:sz w:val="28"/>
         </w:rPr>
-        <w:t xml:space="preserve">(given testimony in) its review is strictly prohibited. </w:t>
       </w:r>
     </w:p>
     <w:p>
@@ -7075,7 +6862,7 @@
           <w:color w:val="000000"/>
           <w:sz w:val="28"/>
         </w:rPr>
-        <w:t xml:space="preserve">32. The principle of “do no harm” is applied to complainants — it is </w:t>
+        <w:t>32. Shikoyatchilarga nisbatan "zarar yetkazma" tamoyili qo'llaniladi — shikoyat berish natijasida shikoyatchiga hech qanday zarar yetkazilmaslik ta'minlanadi; zarur hollarda ularga muqobil ilmiy rahbar yoki guruh tayinlanishi mumkin.</w:t>
       </w:r>
       <w:r>
         <w:rPr>
@@ -7085,7 +6872,6 @@
           <w:color w:val="000000"/>
           <w:sz w:val="28"/>
         </w:rPr>
-        <w:t xml:space="preserve">ensured that a complainant does not suffer any disadvantage as a result of </w:t>
       </w:r>
       <w:r>
         <w:rPr>
@@ -7095,7 +6881,6 @@
           <w:color w:val="000000"/>
           <w:sz w:val="28"/>
         </w:rPr>
-        <w:t xml:space="preserve">filing a complaint; where necessary, an alternative academic supervisor or </w:t>
       </w:r>
       <w:r>
         <w:rPr>
@@ -7105,7 +6890,6 @@
           <w:color w:val="000000"/>
           <w:sz w:val="28"/>
         </w:rPr>
-        <w:t xml:space="preserve">group may be assigned to them. </w:t>
       </w:r>
     </w:p>
     <w:p>
@@ -7161,6 +6945,7 @@
       </w:pPr>
       <w:r>
         <w:tab/>
+        <w:t>10-BOB. ASOSSIZ VA YOLG'ON SHIKOYATLAR 34. Vijdonan berilgan, lekin tekshirish natijasida asossiz deb topilgan shikoyat bo'yicha shikoyatchiga nisbatan hech qanday chora ko'rilmaydi.</w:t>
       </w:r>
       <w:r>
         <w:rPr>
@@ -7170,7 +6955,6 @@
           <w:color w:val="2E74B5"/>
           <w:sz w:val="28"/>
         </w:rPr>
-        <w:t xml:space="preserve">CHAPTER 10. UNFOUNDED AND FALSE COMPLAINTS </w:t>
       </w:r>
       <w:r>
         <w:rPr>
@@ -7180,7 +6964,6 @@
           <w:color w:val="000000"/>
           <w:sz w:val="28"/>
         </w:rPr>
-        <w:t xml:space="preserve">34. No measure is applied against a complainant in respect of a </w:t>
       </w:r>
       <w:r>
         <w:rPr>
@@ -7190,7 +6973,6 @@
           <w:color w:val="000000"/>
           <w:sz w:val="28"/>
         </w:rPr>
-        <w:t xml:space="preserve">complaint filed in good faith but found, upon investigation, to be unfounded. </w:t>
       </w:r>
     </w:p>
     <w:p>
@@ -7210,7 +6992,7 @@
           <w:color w:val="000000"/>
           <w:sz w:val="28"/>
         </w:rPr>
-        <w:t xml:space="preserve">35. Where it is established that a complaint was filed with knowingly </w:t>
+        <w:t>35. Shikoyat ataylab yolg'on ma'lumotlar bilan yoki boshqa shaxsni qasddan tuhmatlovchi niyatda berilganligi aniqlanganda, javobgar shaxs amaldagi qonun hujjatlari va Universitet ichki hujjatlariga muvofiq javobgarlikka tortilishi mumkin.</w:t>
       </w:r>
       <w:r>
         <w:rPr>
@@ -7220,7 +7002,6 @@
           <w:color w:val="000000"/>
           <w:sz w:val="28"/>
         </w:rPr>
-        <w:t xml:space="preserve">false information or with the deliberate intent to defame another person, the </w:t>
       </w:r>
       <w:r>
         <w:rPr>
@@ -7230,7 +7011,6 @@
           <w:color w:val="000000"/>
           <w:sz w:val="28"/>
         </w:rPr>
-        <w:t xml:space="preserve">person responsible may be held liable in accordance with applicable </w:t>
       </w:r>
       <w:r>
         <w:rPr>
@@ -7240,7 +7020,6 @@
           <w:color w:val="000000"/>
           <w:sz w:val="28"/>
         </w:rPr>
-        <w:t xml:space="preserve">legislation and the University’s internal documents. </w:t>
       </w:r>
     </w:p>
     <w:p>
@@ -7544,10 +7323,12 @@
       </w:pPr>
       <w:r>
         <w:tab/>
-      </w:r>
-      <w:r>
         <w:tab/>
-      </w:r>
+        <w:t xml:space="preserve">12-BOB. YAKUNIY QOIDALAR </w:t>
+        <w:br/>
+        <w:t>40. Ushbu Yo'riqnoma Fakultet kengashi tomonidan qabul qilingan kundan boshlab kuchga kiradi.</w:t>
+      </w:r>
+      <w:r/>
       <w:r>
         <w:rPr>
           <w:rFonts w:ascii="Arial" w:hAnsi="Arial" w:eastAsia="Arial"/>
@@ -7556,11 +7337,8 @@
           <w:color w:val="2E74B5"/>
           <w:sz w:val="28"/>
         </w:rPr>
-        <w:t xml:space="preserve">CHAPTER 12. FINAL PROVISIONS </w:t>
-      </w:r>
-      <w:r>
-        <w:br/>
-      </w:r>
+      </w:r>
+      <w:r/>
       <w:r>
         <w:rPr>
           <w:rFonts w:ascii="Arial" w:hAnsi="Arial" w:eastAsia="Arial"/>
@@ -7569,7 +7347,6 @@
           <w:color w:val="000000"/>
           <w:sz w:val="28"/>
         </w:rPr>
-        <w:t xml:space="preserve">40. This Guideline enters into force on the date of its adoption by the </w:t>
       </w:r>
       <w:r>
         <w:rPr>
@@ -7579,7 +7356,6 @@
           <w:color w:val="000000"/>
           <w:sz w:val="28"/>
         </w:rPr>
-        <w:t xml:space="preserve">Faculty Council. </w:t>
       </w:r>
     </w:p>
     <w:p>
@@ -7646,7 +7422,7 @@
           <w:color w:val="000000"/>
           <w:sz w:val="28"/>
         </w:rPr>
-        <w:t xml:space="preserve">42. Where the provisions of this Guideline conflict with other internal </w:t>
+        <w:t>42. Ushbu Yo'riqnoma qoidalari Universitetning boshqa ichki hujjatlari bilan zid kelganda, shikoyatchining huquqlarini kengroq himoya qiluvchi qoida qo'llaniladi.</w:t>
       </w:r>
       <w:r>
         <w:rPr>
@@ -7656,7 +7432,6 @@
           <w:color w:val="000000"/>
           <w:sz w:val="28"/>
         </w:rPr>
-        <w:t xml:space="preserve">documents of the University, the provision offering broader protection of the </w:t>
       </w:r>
       <w:r>
         <w:rPr>
@@ -7666,7 +7441,6 @@
           <w:color w:val="000000"/>
           <w:sz w:val="28"/>
         </w:rPr>
-        <w:t xml:space="preserve">complainant’s rights shall apply. </w:t>
       </w:r>
     </w:p>
     <w:p>
@@ -7686,7 +7460,7 @@
           <w:color w:val="000000"/>
           <w:sz w:val="28"/>
         </w:rPr>
-        <w:t xml:space="preserve">43. The text of the Guideline, the complaint-filing channels, and sample </w:t>
+        <w:t>43. Yo'riqnoma matni, shikoyat berish kanallari va namuna hujjatlar Fakultetning rasmiy veb-saytida va rasmiy Telegram kanalida doimiy va ochiq ravishda taqdim etiladi.</w:t>
       </w:r>
       <w:r>
         <w:rPr>
@@ -7696,7 +7470,6 @@
           <w:color w:val="000000"/>
           <w:sz w:val="28"/>
         </w:rPr>
-        <w:t xml:space="preserve">documents are permanently and openly made available on the Faculty’s </w:t>
       </w:r>
       <w:r>
         <w:rPr>
@@ -7706,7 +7479,6 @@
           <w:color w:val="000000"/>
           <w:sz w:val="28"/>
         </w:rPr>
-        <w:t xml:space="preserve">official website and official Telegram channel. </w:t>
       </w:r>
     </w:p>
     <w:p>
@@ -7812,7 +7584,7 @@
           <w:color w:val="000000"/>
           <w:sz w:val="28"/>
         </w:rPr>
-        <w:t xml:space="preserve">44. This Guideline has been developed in accordance with the </w:t>
+        <w:t>44. Ushbu Yo'riqnoma Yevropa oliy ta'lim makonida sifat ta'minlash standartlari va yo'riqnomalariga (ESG, 2015) muvofiq ishlab chiqilgan va dasturiy hamda institutsional akkreditatsiya uchun Fakultetning o'z-o'zini baholash hisobotida tasdiqlovchi dalil sifatida foydalanishga mo'ljallangan. Quyidagi jadvalda tegishli ESG standartlari va Yo'riqnoma moddalari o'rtasidagi muvofiqlik ko'rsatilgan:</w:t>
       </w:r>
       <w:r>
         <w:rPr>
@@ -7822,7 +7594,6 @@
           <w:color w:val="000000"/>
           <w:sz w:val="28"/>
         </w:rPr>
-        <w:t xml:space="preserve">Standards and Guidelines for Quality Assurance in the European Higher </w:t>
       </w:r>
       <w:r>
         <w:rPr>
@@ -7832,7 +7603,6 @@
           <w:color w:val="000000"/>
           <w:sz w:val="28"/>
         </w:rPr>
-        <w:t xml:space="preserve">Education Area (ESG, 2015) and is intended for use as supporting evidence </w:t>
       </w:r>
       <w:r>
         <w:rPr>
@@ -7842,7 +7612,6 @@
           <w:color w:val="000000"/>
           <w:sz w:val="28"/>
         </w:rPr>
-        <w:t xml:space="preserve">in the Faculty’s self-assessment report for program and institutional </w:t>
       </w:r>
       <w:r>
         <w:rPr>
@@ -7852,7 +7621,6 @@
           <w:color w:val="000000"/>
           <w:sz w:val="28"/>
         </w:rPr>
-        <w:t xml:space="preserve">accreditation. The table below shows the correspondence between the </w:t>
       </w:r>
       <w:r>
         <w:rPr>
@@ -7862,7 +7630,6 @@
           <w:color w:val="000000"/>
           <w:sz w:val="28"/>
         </w:rPr>
-        <w:t xml:space="preserve">relevant ESG standards and the articles of the Guideline: </w:t>
       </w:r>
     </w:p>
     <w:tbl>
@@ -9000,11 +8767,11 @@
           <w:color w:val="000000"/>
           <w:sz w:val="28"/>
         </w:rPr>
-        <w:t xml:space="preserve">ANNEXES </w:t>
-      </w:r>
-      <w:r>
+        <w:t xml:space="preserve">ILOVALAR </w:t>
         <w:br/>
-      </w:r>
+        <w:t>1-ilova. Shikoyat ariza shakli (namuna)</w:t>
+      </w:r>
+      <w:r/>
       <w:r>
         <w:rPr>
           <w:rFonts w:ascii="Arial" w:hAnsi="Arial" w:eastAsia="Arial"/>
@@ -9013,7 +8780,6 @@
           <w:color w:val="2E74B5"/>
           <w:sz w:val="28"/>
         </w:rPr>
-        <w:t xml:space="preserve">Annex 1. Complaint Application Form (Sample) </w:t>
       </w:r>
     </w:p>
     <w:tbl>
@@ -11404,7 +11170,17 @@
           <w:color w:val="2E74B5"/>
           <w:sz w:val="28"/>
         </w:rPr>
-        <w:t xml:space="preserve">Annex 3. Composition of the Faculty Appeals Committee (Sample) </w:t>
+        <w:t xml:space="preserve">3-ilova. Fakultet apellyatsiya qo'mitasining tarkibi (namuna) Rais — Dekan (dastlabki qarorni qabul qilishda ishtirok etmagan bo'lsa); Fizika kafedrasidan bir vakil; </w:t>
+        <w:br/>
+        <w:t xml:space="preserve">Matematik tahlil kafedrasidan bir vakil; </w:t>
+        <w:br/>
+        <w:t xml:space="preserve">Algebra va geometriya kafedrasidan bir vakil; </w:t>
+        <w:br/>
+        <w:t xml:space="preserve">Fakultet Talabalar kengashi vakili; </w:t>
+        <w:br/>
+        <w:t xml:space="preserve">yuridik xizmat vakili (maslahat berish huquqi bilan, ovoz berish huquqisiz); </w:t>
+        <w:br/>
+        <w:t>Fakultet oqsoqollar kengashi vakili (kuzatuvchi sifatida).</w:t>
       </w:r>
       <w:r>
         <w:rPr>
@@ -11414,7 +11190,6 @@
           <w:color w:val="000000"/>
           <w:sz w:val="28"/>
         </w:rPr>
-        <w:t xml:space="preserve">Chair — the Dean (provided they were not involved in the initial decision); </w:t>
       </w:r>
       <w:r>
         <w:rPr>
@@ -11424,11 +11199,8 @@
           <w:color w:val="000000"/>
           <w:sz w:val="28"/>
         </w:rPr>
-        <w:t xml:space="preserve">one representative from the Department of Physics; </w:t>
-      </w:r>
-      <w:r>
-        <w:br/>
-      </w:r>
+      </w:r>
+      <w:r/>
       <w:r>
         <w:rPr>
           <w:rFonts w:ascii="Arial" w:hAnsi="Arial" w:eastAsia="Arial"/>
@@ -11437,11 +11209,8 @@
           <w:color w:val="000000"/>
           <w:sz w:val="28"/>
         </w:rPr>
-        <w:t xml:space="preserve">one representative from the Department of Mathematical Analysis; </w:t>
-      </w:r>
-      <w:r>
-        <w:br/>
-      </w:r>
+      </w:r>
+      <w:r/>
       <w:r>
         <w:rPr>
           <w:rFonts w:ascii="Arial" w:hAnsi="Arial" w:eastAsia="Arial"/>
@@ -11450,11 +11219,8 @@
           <w:color w:val="000000"/>
           <w:sz w:val="28"/>
         </w:rPr>
-        <w:t xml:space="preserve">one representative from the Department of Algebra and Geometry; </w:t>
-      </w:r>
-      <w:r>
-        <w:br/>
-      </w:r>
+      </w:r>
+      <w:r/>
       <w:r>
         <w:rPr>
           <w:rFonts w:ascii="Arial" w:hAnsi="Arial" w:eastAsia="Arial"/>
@@ -11463,11 +11229,8 @@
           <w:color w:val="000000"/>
           <w:sz w:val="28"/>
         </w:rPr>
-        <w:t xml:space="preserve">a representative of the Faculty Student Council; </w:t>
-      </w:r>
-      <w:r>
-        <w:br/>
-      </w:r>
+      </w:r>
+      <w:r/>
       <w:r>
         <w:rPr>
           <w:rFonts w:ascii="Arial" w:hAnsi="Arial" w:eastAsia="Arial"/>
@@ -11476,7 +11239,6 @@
           <w:color w:val="000000"/>
           <w:sz w:val="28"/>
         </w:rPr>
-        <w:t xml:space="preserve">a representative of the legal service (in an advisory capacity, without the right </w:t>
       </w:r>
       <w:r>
         <w:rPr>
@@ -11486,11 +11248,8 @@
           <w:color w:val="000000"/>
           <w:sz w:val="28"/>
         </w:rPr>
-        <w:t xml:space="preserve">to vote); </w:t>
-      </w:r>
-      <w:r>
-        <w:br/>
-      </w:r>
+      </w:r>
+      <w:r/>
       <w:r>
         <w:rPr>
           <w:rFonts w:ascii="Arial" w:hAnsi="Arial" w:eastAsia="Arial"/>
@@ -11499,7 +11258,6 @@
           <w:color w:val="000000"/>
           <w:sz w:val="28"/>
         </w:rPr>
-        <w:t xml:space="preserve">a representative of the Faculty Council of Elders (as an observer). </w:t>
       </w:r>
     </w:p>
     <w:sectPr>

</xml_diff>